<commit_message>
chore: update CV document for Jose Eliecer Rivera\n\nUpdated Jose Eliecer Rivera's CV with new information
</commit_message>
<xml_diff>
--- a/public/CV_Jose_Eliecer_Rivera_2026.docx
+++ b/public/CV_Jose_Eliecer_Rivera_2026.docx
@@ -10,125 +10,180 @@
         <w:tblLook w:firstColumn="1" w:firstRow="1" w:lastColumn="0" w:lastRow="0" w:noHBand="0" w:noVBand="1" w:val="04A0"/>
       </w:tblPr>
       <w:tblGrid>
-        <w:gridCol w:w="7632"/>
-        <w:gridCol w:w="3024"/>
+        <w:gridCol w:w="6912"/>
+        <w:gridCol w:w="3744"/>
       </w:tblGrid>
       <w:tr>
         <w:tc>
           <w:tcPr>
-            <w:tcW w:type="dxa" w:w="5371"/>
-            <w:shd w:fill="16283F"/>
+            <w:tcW w:type="dxa" w:w="5515"/>
+            <w:shd w:fill="172A3A"/>
             <w:tcMar>
-              <w:top w:w="180" w:type="dxa"/>
-              <w:start w:w="230" w:type="dxa"/>
-              <w:bottom w:w="180" w:type="dxa"/>
-              <w:end w:w="230" w:type="dxa"/>
+              <w:top w:w="110" w:type="dxa"/>
+              <w:start w:w="170" w:type="dxa"/>
+              <w:bottom w:w="100" w:type="dxa"/>
+              <w:end w:w="100" w:type="dxa"/>
             </w:tcMar>
             <w:tcBorders>
               <w:top w:val="nil"/>
+              <w:left w:val="nil"/>
               <w:bottom w:val="nil"/>
-              <w:start w:val="nil"/>
-              <w:end w:val="nil"/>
+              <w:right w:val="nil"/>
+              <w:insideH w:val="nil"/>
+              <w:insideV w:val="nil"/>
             </w:tcBorders>
           </w:tcPr>
           <w:p>
             <w:pPr>
-              <w:spacing w:after="40"/>
+              <w:spacing w:before="0" w:after="0" w:line="240" w:lineRule="auto"/>
             </w:pPr>
             <w:r>
               <w:rPr>
-                <w:rFonts w:ascii="Aptos" w:hAnsi="Aptos"/>
+                <w:rFonts w:ascii="Arial" w:hAnsi="Arial"/>
                 <w:b/>
                 <w:color w:val="FFFFFF"/>
-                <w:sz w:val="44"/>
+                <w:sz w:val="38"/>
               </w:rPr>
-              <w:t>JOSÉ ELIECER</w:t>
-            </w:r>
-            <w:r>
-              <w:rPr>
-                <w:rFonts w:ascii="Aptos" w:hAnsi="Aptos"/>
-                <w:b/>
-                <w:color w:val="68C5E8"/>
-                <w:sz w:val="44"/>
-              </w:rPr>
-              <w:t xml:space="preserve"> RIVERA PÉREZ</w:t>
+              <w:t>JOSÉ ELIECER RIVERA</w:t>
             </w:r>
           </w:p>
           <w:p>
             <w:pPr>
-              <w:spacing w:after="0"/>
+              <w:spacing w:before="20" w:after="0" w:line="240" w:lineRule="auto"/>
             </w:pPr>
             <w:r>
               <w:rPr>
-                <w:rFonts w:ascii="Aptos" w:hAnsi="Aptos"/>
+                <w:rFonts w:ascii="Arial" w:hAnsi="Arial"/>
                 <w:b/>
-                <w:color w:val="FFFFFF"/>
-                <w:sz w:val="20"/>
+                <w:color w:val="BEE1EF"/>
+                <w:sz w:val="16"/>
               </w:rPr>
-              <w:t>ANALISTA PROGRAMADOR  ·  DESARROLLADOR FULL STACK</w:t>
+              <w:t>DESARROLLADOR FULL STACK  ·  TNS ANALISTA PROGRAMADOR</w:t>
             </w:r>
           </w:p>
         </w:tc>
         <w:tc>
           <w:tcPr>
-            <w:tcW w:type="dxa" w:w="5371"/>
-            <w:shd w:fill="16283F"/>
+            <w:tcW w:type="dxa" w:w="5515"/>
+            <w:shd w:fill="172A3A"/>
             <w:tcMar>
-              <w:top w:w="180" w:type="dxa"/>
-              <w:start w:w="230" w:type="dxa"/>
-              <w:bottom w:w="180" w:type="dxa"/>
-              <w:end w:w="230" w:type="dxa"/>
+              <w:top w:w="110" w:type="dxa"/>
+              <w:start w:w="100" w:type="dxa"/>
+              <w:bottom w:w="100" w:type="dxa"/>
+              <w:end w:w="170" w:type="dxa"/>
             </w:tcMar>
             <w:tcBorders>
               <w:top w:val="nil"/>
+              <w:left w:val="nil"/>
               <w:bottom w:val="nil"/>
-              <w:start w:val="nil"/>
-              <w:end w:val="nil"/>
+              <w:right w:val="nil"/>
+              <w:insideH w:val="nil"/>
+              <w:insideV w:val="nil"/>
             </w:tcBorders>
           </w:tcPr>
           <w:p>
             <w:pPr>
+              <w:spacing w:before="0" w:after="0" w:line="240" w:lineRule="auto"/>
               <w:jc w:val="right"/>
             </w:pPr>
             <w:r>
               <w:rPr>
-                <w:rFonts w:ascii="Aptos" w:hAnsi="Aptos"/>
+                <w:rFonts w:ascii="Arial" w:hAnsi="Arial"/>
                 <w:b w:val="0"/>
                 <w:color w:val="FFFFFF"/>
-                <w:sz w:val="16"/>
+                <w:sz w:val="15"/>
+              </w:rPr>
+              <w:t>Chillán, Región de Ñuble</w:t>
+            </w:r>
+          </w:p>
+          <w:p>
+            <w:pPr>
+              <w:spacing w:before="0" w:after="0" w:line="240" w:lineRule="auto"/>
+              <w:jc w:val="right"/>
+            </w:pPr>
+            <w:r>
+              <w:rPr>
+                <w:rFonts w:ascii="Arial" w:hAnsi="Arial"/>
+                <w:b w:val="0"/>
+                <w:color w:val="FFFFFF"/>
+                <w:sz w:val="15"/>
               </w:rPr>
               <w:t>rjoseeliecer@gmail.com</w:t>
-              <w:br/>
             </w:r>
+          </w:p>
+          <w:p>
+            <w:pPr>
+              <w:spacing w:before="0" w:after="0" w:line="240" w:lineRule="auto"/>
+              <w:jc w:val="right"/>
+            </w:pPr>
             <w:r>
               <w:rPr>
-                <w:rFonts w:ascii="Aptos" w:hAnsi="Aptos"/>
+                <w:rFonts w:ascii="Arial" w:hAnsi="Arial"/>
                 <w:b w:val="0"/>
                 <w:color w:val="FFFFFF"/>
-                <w:sz w:val="16"/>
+                <w:sz w:val="15"/>
               </w:rPr>
-              <w:t>+56 9 8353 8923</w:t>
-              <w:br/>
+              <w:t>github.com/rjoserivera</w:t>
             </w:r>
+          </w:p>
+        </w:tc>
+      </w:tr>
+    </w:tbl>
+    <w:tbl>
+      <w:tblPr>
+        <w:tblW w:type="auto" w:w="0"/>
+        <w:jc w:val="center"/>
+        <w:tblLook w:firstColumn="1" w:firstRow="1" w:lastColumn="0" w:lastRow="0" w:noHBand="0" w:noVBand="1" w:val="04A0"/>
+      </w:tblPr>
+      <w:tblGrid>
+        <w:gridCol w:w="11030"/>
+      </w:tblGrid>
+      <w:tr>
+        <w:tc>
+          <w:tcPr>
+            <w:tcW w:type="dxa" w:w="11030"/>
+            <w:shd w:fill="EAF3F7"/>
+            <w:tcMar>
+              <w:top w:w="70" w:type="dxa"/>
+              <w:start w:w="130" w:type="dxa"/>
+              <w:bottom w:w="70" w:type="dxa"/>
+              <w:end w:w="130" w:type="dxa"/>
+            </w:tcMar>
+            <w:tcBorders>
+              <w:top w:val="nil"/>
+              <w:left w:val="nil"/>
+              <w:bottom w:val="nil"/>
+              <w:right w:val="nil"/>
+              <w:insideH w:val="nil"/>
+              <w:insideV w:val="nil"/>
+            </w:tcBorders>
+          </w:tcPr>
+          <w:p>
+            <w:pPr>
+              <w:spacing w:before="0" w:after="20" w:line="240" w:lineRule="auto"/>
+            </w:pPr>
             <w:r>
               <w:rPr>
-                <w:rFonts w:ascii="Aptos" w:hAnsi="Aptos"/>
-                <w:b w:val="0"/>
-                <w:color w:val="FFFFFF"/>
-                <w:sz w:val="16"/>
+                <w:rFonts w:ascii="Arial" w:hAnsi="Arial"/>
+                <w:b/>
+                <w:color w:val="1677A3"/>
+                <w:sz w:val="18"/>
               </w:rPr>
-              <w:t>github.com/rjoserivera</w:t>
-              <w:br/>
+              <w:t>PERFIL PROFESIONAL</w:t>
             </w:r>
+          </w:p>
+          <w:p>
+            <w:pPr>
+              <w:spacing w:before="0" w:after="0" w:line="245" w:lineRule="auto"/>
+            </w:pPr>
             <w:r>
               <w:rPr>
-                <w:rFonts w:ascii="Aptos" w:hAnsi="Aptos"/>
+                <w:rFonts w:ascii="Arial" w:hAnsi="Arial"/>
                 <w:b w:val="0"/>
-                <w:color w:val="FFFFFF"/>
-                <w:sz w:val="16"/>
+                <w:color w:val="1F2937"/>
+                <w:sz w:val="15"/>
               </w:rPr>
-              <w:t>linkedin.com/in/rjoseeliecer</w:t>
-              <w:br/>
+              <w:t>Desarrollador Full Stack proactivo, curioso y orientado a soluciones. Experiencia creando productos web completos y contribuyendo en equipos mediante correcciones, nuevas funcionalidades e integración de flujos. Destaco por aprender rápido, adaptarme a tecnologías nuevas, organizar el trabajo y participar activamente desde el análisis hasta la entrega.</w:t>
             </w:r>
           </w:p>
         </w:tc>
@@ -142,226 +197,346 @@
         <w:tblLook w:firstColumn="1" w:firstRow="1" w:lastColumn="0" w:lastRow="0" w:noHBand="0" w:noVBand="1" w:val="04A0"/>
       </w:tblPr>
       <w:tblGrid>
-        <w:gridCol w:w="3240"/>
-        <w:gridCol w:w="7416"/>
+        <w:gridCol w:w="3283"/>
+        <w:gridCol w:w="7373"/>
       </w:tblGrid>
       <w:tr>
         <w:tc>
           <w:tcPr>
-            <w:tcW w:type="dxa" w:w="5371"/>
-            <w:shd w:fill="EEF4F7"/>
+            <w:tcW w:type="dxa" w:w="5515"/>
+            <w:vAlign w:val="top"/>
+            <w:shd w:fill="F4F7F9"/>
             <w:tcMar>
-              <w:top w:w="120" w:type="dxa"/>
-              <w:start w:w="200" w:type="dxa"/>
-              <w:bottom w:w="120" w:type="dxa"/>
-              <w:end w:w="200" w:type="dxa"/>
+              <w:top w:w="65" w:type="dxa"/>
+              <w:start w:w="120" w:type="dxa"/>
+              <w:bottom w:w="50" w:type="dxa"/>
+              <w:end w:w="115" w:type="dxa"/>
             </w:tcMar>
-            <w:vAlign w:val="top"/>
             <w:tcBorders>
               <w:top w:val="nil"/>
+              <w:left w:val="nil"/>
               <w:bottom w:val="nil"/>
-              <w:start w:val="nil"/>
-              <w:end w:val="nil"/>
+              <w:right w:val="nil"/>
+              <w:insideH w:val="nil"/>
+              <w:insideV w:val="nil"/>
             </w:tcBorders>
           </w:tcPr>
           <w:p/>
           <w:p>
             <w:pPr>
-              <w:spacing w:before="160" w:after="100"/>
-              <w:pBdr>
-                <w:bottom w:val="single" w:sz="8" w:space="3" w:color="1677A8"/>
-              </w:pBdr>
+              <w:keepNext/>
+              <w:spacing w:before="80" w:after="40" w:line="240" w:lineRule="auto"/>
             </w:pPr>
             <w:r>
               <w:rPr>
-                <w:rFonts w:ascii="Aptos" w:hAnsi="Aptos"/>
+                <w:rFonts w:ascii="Arial" w:hAnsi="Arial"/>
                 <w:b/>
-                <w:color w:val="1677A8"/>
+                <w:color w:val="1677A3"/>
                 <w:sz w:val="18"/>
               </w:rPr>
-              <w:t>COMPETENCIAS TÉCNICAS</w:t>
+              <w:t>COMPETENCIAS</w:t>
             </w:r>
           </w:p>
           <w:p>
             <w:pPr>
-              <w:spacing w:before="80" w:after="20"/>
+              <w:pStyle w:val="ListBullet"/>
+              <w:spacing w:before="0" w:after="12" w:line="240" w:lineRule="auto"/>
+              <w:ind w:left="202" w:hanging="144"/>
             </w:pPr>
             <w:r>
               <w:rPr>
-                <w:rFonts w:ascii="Aptos" w:hAnsi="Aptos"/>
-                <w:b/>
-                <w:color w:val="16283F"/>
-                <w:sz w:val="17"/>
+                <w:rFonts w:ascii="Arial" w:hAnsi="Arial"/>
+                <w:b w:val="0"/>
+                <w:color w:val="1F2937"/>
+                <w:sz w:val="15"/>
               </w:rPr>
-              <w:t>Frontend</w:t>
+              <w:t>Trabajo en equipo</w:t>
             </w:r>
           </w:p>
           <w:p>
             <w:pPr>
-              <w:spacing w:after="60"/>
+              <w:pStyle w:val="ListBullet"/>
+              <w:spacing w:before="0" w:after="12" w:line="240" w:lineRule="auto"/>
+              <w:ind w:left="202" w:hanging="144"/>
             </w:pPr>
             <w:r>
               <w:rPr>
-                <w:rFonts w:ascii="Aptos" w:hAnsi="Aptos"/>
+                <w:rFonts w:ascii="Arial" w:hAnsi="Arial"/>
                 <w:b w:val="0"/>
-                <w:color w:val="5C6B78"/>
-                <w:sz w:val="16"/>
+                <w:color w:val="1F2937"/>
+                <w:sz w:val="15"/>
               </w:rPr>
-              <w:t>JavaScript · TypeScript · React · Next.js · Vite · Tailwind CSS · Bootstrap</w:t>
+              <w:t>Liderazgo y organización</w:t>
             </w:r>
           </w:p>
           <w:p>
             <w:pPr>
-              <w:spacing w:before="80" w:after="20"/>
+              <w:pStyle w:val="ListBullet"/>
+              <w:spacing w:before="0" w:after="12" w:line="240" w:lineRule="auto"/>
+              <w:ind w:left="202" w:hanging="144"/>
             </w:pPr>
             <w:r>
               <w:rPr>
-                <w:rFonts w:ascii="Aptos" w:hAnsi="Aptos"/>
-                <w:b/>
-                <w:color w:val="16283F"/>
-                <w:sz w:val="17"/>
+                <w:rFonts w:ascii="Arial" w:hAnsi="Arial"/>
+                <w:b w:val="0"/>
+                <w:color w:val="1F2937"/>
+                <w:sz w:val="15"/>
               </w:rPr>
-              <w:t>Backend</w:t>
+              <w:t>Resolución de problemas</w:t>
             </w:r>
           </w:p>
           <w:p>
             <w:pPr>
-              <w:spacing w:after="60"/>
+              <w:pStyle w:val="ListBullet"/>
+              <w:spacing w:before="0" w:after="12" w:line="240" w:lineRule="auto"/>
+              <w:ind w:left="202" w:hanging="144"/>
             </w:pPr>
             <w:r>
               <w:rPr>
-                <w:rFonts w:ascii="Aptos" w:hAnsi="Aptos"/>
+                <w:rFonts w:ascii="Arial" w:hAnsi="Arial"/>
                 <w:b w:val="0"/>
-                <w:color w:val="5C6B78"/>
-                <w:sz w:val="16"/>
+                <w:color w:val="1F2937"/>
+                <w:sz w:val="15"/>
               </w:rPr>
-              <w:t>PHP · Node.js · Python · Django · Laravel</w:t>
+              <w:t>Aprendizaje rápido</w:t>
             </w:r>
           </w:p>
           <w:p>
             <w:pPr>
-              <w:spacing w:before="80" w:after="20"/>
+              <w:pStyle w:val="ListBullet"/>
+              <w:spacing w:before="0" w:after="12" w:line="240" w:lineRule="auto"/>
+              <w:ind w:left="202" w:hanging="144"/>
             </w:pPr>
             <w:r>
               <w:rPr>
-                <w:rFonts w:ascii="Aptos" w:hAnsi="Aptos"/>
-                <w:b/>
-                <w:color w:val="16283F"/>
-                <w:sz w:val="17"/>
+                <w:rFonts w:ascii="Arial" w:hAnsi="Arial"/>
+                <w:b w:val="0"/>
+                <w:color w:val="1F2937"/>
+                <w:sz w:val="15"/>
               </w:rPr>
-              <w:t>Datos</w:t>
+              <w:t>Comunicación efectiva</w:t>
             </w:r>
           </w:p>
           <w:p>
             <w:pPr>
-              <w:spacing w:after="60"/>
+              <w:pStyle w:val="ListBullet"/>
+              <w:spacing w:before="0" w:after="12" w:line="240" w:lineRule="auto"/>
+              <w:ind w:left="202" w:hanging="144"/>
             </w:pPr>
             <w:r>
               <w:rPr>
-                <w:rFonts w:ascii="Aptos" w:hAnsi="Aptos"/>
+                <w:rFonts w:ascii="Arial" w:hAnsi="Arial"/>
                 <w:b w:val="0"/>
-                <w:color w:val="5C6B78"/>
-                <w:sz w:val="16"/>
+                <w:color w:val="1F2937"/>
+                <w:sz w:val="15"/>
               </w:rPr>
-              <w:t>MySQL · MariaDB · SQLite · Supabase</w:t>
+              <w:t>Adaptabilidad</w:t>
             </w:r>
           </w:p>
           <w:p>
             <w:pPr>
-              <w:spacing w:before="80" w:after="20"/>
+              <w:keepNext/>
+              <w:spacing w:before="100" w:after="40" w:line="240" w:lineRule="auto"/>
             </w:pPr>
             <w:r>
               <w:rPr>
-                <w:rFonts w:ascii="Aptos" w:hAnsi="Aptos"/>
+                <w:rFonts w:ascii="Arial" w:hAnsi="Arial"/>
                 <w:b/>
-                <w:color w:val="16283F"/>
-                <w:sz w:val="17"/>
+                <w:color w:val="1677A3"/>
+                <w:sz w:val="18"/>
               </w:rPr>
-              <w:t>IA</w:t>
+              <w:t>STACK TÉCNICO</w:t>
             </w:r>
           </w:p>
           <w:p>
             <w:pPr>
-              <w:spacing w:after="60"/>
+              <w:spacing w:before="0" w:after="24" w:line="240" w:lineRule="auto"/>
             </w:pPr>
             <w:r>
               <w:rPr>
-                <w:rFonts w:ascii="Aptos" w:hAnsi="Aptos"/>
+                <w:rFonts w:ascii="Arial" w:hAnsi="Arial"/>
+                <w:b/>
+                <w:color w:val="1F2937"/>
+                <w:sz w:val="15"/>
+              </w:rPr>
+              <w:t xml:space="preserve">Frontend: </w:t>
+            </w:r>
+            <w:r>
+              <w:rPr>
+                <w:rFonts w:ascii="Arial" w:hAnsi="Arial"/>
                 <w:b w:val="0"/>
-                <w:color w:val="5C6B78"/>
-                <w:sz w:val="16"/>
+                <w:color w:val="4B5563"/>
+                <w:sz w:val="14"/>
               </w:rPr>
-              <w:t>OpenAI · Claude · LLMs · Agentes de IA</w:t>
+              <w:t>React, Next.js, TypeScript, JavaScript, HTML5, CSS3, Tailwind</w:t>
             </w:r>
           </w:p>
           <w:p>
             <w:pPr>
-              <w:spacing w:before="80" w:after="20"/>
+              <w:spacing w:before="0" w:after="24" w:line="240" w:lineRule="auto"/>
             </w:pPr>
             <w:r>
               <w:rPr>
-                <w:rFonts w:ascii="Aptos" w:hAnsi="Aptos"/>
+                <w:rFonts w:ascii="Arial" w:hAnsi="Arial"/>
                 <w:b/>
-                <w:color w:val="16283F"/>
-                <w:sz w:val="17"/>
+                <w:color w:val="1F2937"/>
+                <w:sz w:val="15"/>
               </w:rPr>
-              <w:t>Herramientas</w:t>
+              <w:t xml:space="preserve">Backend: </w:t>
+            </w:r>
+            <w:r>
+              <w:rPr>
+                <w:rFonts w:ascii="Arial" w:hAnsi="Arial"/>
+                <w:b w:val="0"/>
+                <w:color w:val="4B5563"/>
+                <w:sz w:val="14"/>
+              </w:rPr>
+              <w:t>Node.js, PHP, Python, Django, REST API, JWT</w:t>
             </w:r>
           </w:p>
           <w:p>
             <w:pPr>
-              <w:spacing w:after="60"/>
+              <w:spacing w:before="0" w:after="24" w:line="240" w:lineRule="auto"/>
             </w:pPr>
             <w:r>
               <w:rPr>
-                <w:rFonts w:ascii="Aptos" w:hAnsi="Aptos"/>
+                <w:rFonts w:ascii="Arial" w:hAnsi="Arial"/>
+                <w:b/>
+                <w:color w:val="1F2937"/>
+                <w:sz w:val="15"/>
+              </w:rPr>
+              <w:t xml:space="preserve">Datos: </w:t>
+            </w:r>
+            <w:r>
+              <w:rPr>
+                <w:rFonts w:ascii="Arial" w:hAnsi="Arial"/>
                 <w:b w:val="0"/>
-                <w:color w:val="5C6B78"/>
-                <w:sz w:val="16"/>
+                <w:color w:val="4B5563"/>
+                <w:sz w:val="14"/>
               </w:rPr>
-              <w:t>Git · GitHub · VS Code · Cursor · Postman · cPanel · Vercel</w:t>
+              <w:t>MySQL, PostgreSQL</w:t>
             </w:r>
           </w:p>
           <w:p>
             <w:pPr>
-              <w:spacing w:before="80" w:after="20"/>
+              <w:spacing w:before="0" w:after="24" w:line="240" w:lineRule="auto"/>
             </w:pPr>
             <w:r>
               <w:rPr>
-                <w:rFonts w:ascii="Aptos" w:hAnsi="Aptos"/>
+                <w:rFonts w:ascii="Arial" w:hAnsi="Arial"/>
                 <w:b/>
-                <w:color w:val="16283F"/>
-                <w:sz w:val="17"/>
+                <w:color w:val="1F2937"/>
+                <w:sz w:val="15"/>
               </w:rPr>
-              <w:t>Metodologías</w:t>
+              <w:t xml:space="preserve">Herramientas: </w:t>
+            </w:r>
+            <w:r>
+              <w:rPr>
+                <w:rFonts w:ascii="Arial" w:hAnsi="Arial"/>
+                <w:b w:val="0"/>
+                <w:color w:val="4B5563"/>
+                <w:sz w:val="14"/>
+              </w:rPr>
+              <w:t>Git, GitHub, Vercel, PWA, IA aplicada</w:t>
             </w:r>
           </w:p>
           <w:p>
             <w:pPr>
-              <w:spacing w:after="60"/>
+              <w:keepNext/>
+              <w:spacing w:before="100" w:after="40" w:line="240" w:lineRule="auto"/>
             </w:pPr>
             <w:r>
               <w:rPr>
-                <w:rFonts w:ascii="Aptos" w:hAnsi="Aptos"/>
-                <w:b w:val="0"/>
-                <w:color w:val="5C6B78"/>
-                <w:sz w:val="16"/>
+                <w:rFonts w:ascii="Arial" w:hAnsi="Arial"/>
+                <w:b/>
+                <w:color w:val="1677A3"/>
+                <w:sz w:val="18"/>
               </w:rPr>
-              <w:t>Scrum · Sprints · Trabajo colaborativo</w:t>
+              <w:t>FORMACIÓN</w:t>
             </w:r>
           </w:p>
           <w:p>
             <w:pPr>
-              <w:spacing w:before="160" w:after="100"/>
-              <w:pBdr>
-                <w:bottom w:val="single" w:sz="8" w:space="3" w:color="1677A8"/>
-              </w:pBdr>
+              <w:spacing w:before="0" w:after="26" w:line="240" w:lineRule="auto"/>
             </w:pPr>
             <w:r>
               <w:rPr>
-                <w:rFonts w:ascii="Aptos" w:hAnsi="Aptos"/>
+                <w:rFonts w:ascii="Arial" w:hAnsi="Arial"/>
                 <w:b/>
-                <w:color w:val="1677A8"/>
+                <w:color w:val="1F2937"/>
+                <w:sz w:val="15"/>
+              </w:rPr>
+              <w:t>Ingeniería en Informática</w:t>
+            </w:r>
+            <w:r>
+              <w:rPr>
+                <w:rFonts w:ascii="Arial" w:hAnsi="Arial"/>
+                <w:b w:val="0"/>
+                <w:color w:val="4B5563"/>
+                <w:sz w:val="14"/>
+              </w:rPr>
+              <w:br/>
+              <w:t>En curso</w:t>
+            </w:r>
+          </w:p>
+          <w:p>
+            <w:pPr>
+              <w:spacing w:before="0" w:after="26" w:line="240" w:lineRule="auto"/>
+            </w:pPr>
+            <w:r>
+              <w:rPr>
+                <w:rFonts w:ascii="Arial" w:hAnsi="Arial"/>
+                <w:b/>
+                <w:color w:val="1F2937"/>
+                <w:sz w:val="15"/>
+              </w:rPr>
+              <w:t>TNS Analista Programador</w:t>
+            </w:r>
+            <w:r>
+              <w:rPr>
+                <w:rFonts w:ascii="Arial" w:hAnsi="Arial"/>
+                <w:b w:val="0"/>
+                <w:color w:val="4B5563"/>
+                <w:sz w:val="14"/>
+              </w:rPr>
+              <w:br/>
+              <w:t>Titulado · 2026</w:t>
+            </w:r>
+          </w:p>
+          <w:p>
+            <w:pPr>
+              <w:spacing w:before="0" w:after="26" w:line="240" w:lineRule="auto"/>
+            </w:pPr>
+            <w:r>
+              <w:rPr>
+                <w:rFonts w:ascii="Arial" w:hAnsi="Arial"/>
+                <w:b/>
+                <w:color w:val="1F2937"/>
+                <w:sz w:val="15"/>
+              </w:rPr>
+              <w:t>Técnico de Nivel Medio en Electrónica</w:t>
+            </w:r>
+            <w:r>
+              <w:rPr>
+                <w:rFonts w:ascii="Arial" w:hAnsi="Arial"/>
+                <w:b w:val="0"/>
+                <w:color w:val="4B5563"/>
+                <w:sz w:val="14"/>
+              </w:rPr>
+              <w:br/>
+              <w:t>2013–2015 · Titulado 2015</w:t>
+            </w:r>
+          </w:p>
+          <w:p>
+            <w:pPr>
+              <w:keepNext/>
+              <w:spacing w:before="100" w:after="40" w:line="240" w:lineRule="auto"/>
+            </w:pPr>
+            <w:r>
+              <w:rPr>
+                <w:rFonts w:ascii="Arial" w:hAnsi="Arial"/>
+                <w:b/>
+                <w:color w:val="1677A3"/>
                 <w:sz w:val="18"/>
               </w:rPr>
               <w:t>IDIOMAS</w:t>
@@ -369,440 +544,96 @@
           </w:p>
           <w:p>
             <w:pPr>
-              <w:pStyle w:val="CVBullet"/>
-              <w:spacing w:after="40"/>
+              <w:pStyle w:val="ListBullet"/>
+              <w:spacing w:before="0" w:after="12" w:line="240" w:lineRule="auto"/>
+              <w:ind w:left="202" w:hanging="144"/>
             </w:pPr>
             <w:r>
               <w:rPr>
-                <w:rFonts w:ascii="Aptos" w:hAnsi="Aptos"/>
+                <w:rFonts w:ascii="Arial" w:hAnsi="Arial"/>
                 <w:b w:val="0"/>
-                <w:color w:val="263442"/>
-                <w:sz w:val="17"/>
+                <w:color w:val="1F2937"/>
+                <w:sz w:val="15"/>
               </w:rPr>
-              <w:t>Español — Nativo</w:t>
+              <w:t>Español · Nativo</w:t>
             </w:r>
           </w:p>
           <w:p>
             <w:pPr>
-              <w:pStyle w:val="CVBullet"/>
-              <w:spacing w:after="40"/>
+              <w:pStyle w:val="ListBullet"/>
+              <w:spacing w:before="0" w:after="12" w:line="240" w:lineRule="auto"/>
+              <w:ind w:left="202" w:hanging="144"/>
             </w:pPr>
             <w:r>
               <w:rPr>
-                <w:rFonts w:ascii="Aptos" w:hAnsi="Aptos"/>
+                <w:rFonts w:ascii="Arial" w:hAnsi="Arial"/>
                 <w:b w:val="0"/>
-                <w:color w:val="263442"/>
-                <w:sz w:val="17"/>
+                <w:color w:val="1F2937"/>
+                <w:sz w:val="15"/>
               </w:rPr>
-              <w:t>Inglés — Básico / lectura técnica</w:t>
+              <w:t>Inglés · Básico y lectura técnica</w:t>
             </w:r>
           </w:p>
           <w:p>
             <w:pPr>
-              <w:spacing w:before="160" w:after="100"/>
-              <w:pBdr>
-                <w:bottom w:val="single" w:sz="8" w:space="3" w:color="1677A8"/>
-              </w:pBdr>
+              <w:keepNext/>
+              <w:spacing w:before="100" w:after="40" w:line="240" w:lineRule="auto"/>
             </w:pPr>
             <w:r>
               <w:rPr>
-                <w:rFonts w:ascii="Aptos" w:hAnsi="Aptos"/>
+                <w:rFonts w:ascii="Arial" w:hAnsi="Arial"/>
                 <w:b/>
-                <w:color w:val="1677A8"/>
+                <w:color w:val="1677A3"/>
                 <w:sz w:val="18"/>
               </w:rPr>
-              <w:t>FORTALEZAS</w:t>
+              <w:t>PORTAFOLIO</w:t>
             </w:r>
           </w:p>
           <w:p>
             <w:pPr>
-              <w:pStyle w:val="CVBullet"/>
-              <w:spacing w:after="40"/>
+              <w:spacing w:before="0" w:after="0" w:line="240" w:lineRule="auto"/>
             </w:pPr>
             <w:r>
               <w:rPr>
-                <w:rFonts w:ascii="Aptos" w:hAnsi="Aptos"/>
-                <w:b w:val="0"/>
-                <w:color w:val="263442"/>
-                <w:sz w:val="17"/>
+                <w:rFonts w:ascii="Arial" w:hAnsi="Arial"/>
+                <w:b/>
+                <w:color w:val="1677A3"/>
+                <w:sz w:val="14"/>
               </w:rPr>
-              <w:t>Aprendizaje rápido y adaptación</w:t>
-            </w:r>
-          </w:p>
-          <w:p>
-            <w:pPr>
-              <w:pStyle w:val="CVBullet"/>
-              <w:spacing w:after="40"/>
-            </w:pPr>
-            <w:r>
-              <w:rPr>
-                <w:rFonts w:ascii="Aptos" w:hAnsi="Aptos"/>
-                <w:b w:val="0"/>
-                <w:color w:val="263442"/>
-                <w:sz w:val="17"/>
-              </w:rPr>
-              <w:t>Resolución metódica de problemas</w:t>
-            </w:r>
-          </w:p>
-          <w:p>
-            <w:pPr>
-              <w:pStyle w:val="CVBullet"/>
-              <w:spacing w:after="40"/>
-            </w:pPr>
-            <w:r>
-              <w:rPr>
-                <w:rFonts w:ascii="Aptos" w:hAnsi="Aptos"/>
-                <w:b w:val="0"/>
-                <w:color w:val="263442"/>
-                <w:sz w:val="17"/>
-              </w:rPr>
-              <w:t>Trabajo en equipo y liderazgo</w:t>
-            </w:r>
-          </w:p>
-          <w:p>
-            <w:pPr>
-              <w:pStyle w:val="CVBullet"/>
-              <w:spacing w:after="40"/>
-            </w:pPr>
-            <w:r>
-              <w:rPr>
-                <w:rFonts w:ascii="Aptos" w:hAnsi="Aptos"/>
-                <w:b w:val="0"/>
-                <w:color w:val="263442"/>
-                <w:sz w:val="17"/>
-              </w:rPr>
-              <w:t>Proactividad y orientación a resultados</w:t>
-            </w:r>
-          </w:p>
-          <w:p>
-            <w:pPr>
-              <w:spacing w:before="160" w:after="100"/>
-              <w:pBdr>
-                <w:bottom w:val="single" w:sz="8" w:space="3" w:color="1677A8"/>
-              </w:pBdr>
-            </w:pPr>
-            <w:r>
-              <w:rPr>
-                <w:rFonts w:ascii="Aptos" w:hAnsi="Aptos"/>
-                <w:b/>
-                <w:color w:val="1677A8"/>
-                <w:sz w:val="18"/>
-              </w:rPr>
-              <w:t>FORMACIÓN</w:t>
-            </w:r>
-          </w:p>
-          <w:p>
-            <w:pPr>
-              <w:spacing w:before="80" w:after="20"/>
-            </w:pPr>
-            <w:r>
-              <w:rPr>
-                <w:rFonts w:ascii="Aptos" w:hAnsi="Aptos"/>
-                <w:b/>
-                <w:color w:val="16283F"/>
-                <w:sz w:val="18"/>
-              </w:rPr>
-              <w:t>Ingeniería en Informática</w:t>
-            </w:r>
-            <w:r>
-              <w:rPr>
-                <w:rFonts w:ascii="Aptos" w:hAnsi="Aptos"/>
-                <w:b/>
-                <w:color w:val="1677A8"/>
-                <w:sz w:val="16"/>
-              </w:rPr>
-              <w:t xml:space="preserve">  |  En curso · INACAP</w:t>
-            </w:r>
-          </w:p>
-          <w:p>
-            <w:pPr>
-              <w:spacing w:after="60" w:line="252" w:lineRule="auto"/>
-            </w:pPr>
-            <w:r>
-              <w:rPr>
-                <w:rFonts w:ascii="Aptos" w:hAnsi="Aptos"/>
-                <w:b w:val="0"/>
-                <w:color w:val="5C6B78"/>
-                <w:sz w:val="16"/>
-              </w:rPr>
-              <w:t>2024 – Presente</w:t>
-            </w:r>
-          </w:p>
-          <w:p>
-            <w:pPr>
-              <w:spacing w:before="80" w:after="20"/>
-            </w:pPr>
-            <w:r>
-              <w:rPr>
-                <w:rFonts w:ascii="Aptos" w:hAnsi="Aptos"/>
-                <w:b/>
-                <w:color w:val="16283F"/>
-                <w:sz w:val="18"/>
-              </w:rPr>
-              <w:t>TNS Analista Programador</w:t>
-            </w:r>
-            <w:r>
-              <w:rPr>
-                <w:rFonts w:ascii="Aptos" w:hAnsi="Aptos"/>
-                <w:b/>
-                <w:color w:val="1677A8"/>
-                <w:sz w:val="16"/>
-              </w:rPr>
-              <w:t xml:space="preserve">  |  Titulado 2026 · INACAP</w:t>
-            </w:r>
-          </w:p>
-          <w:p>
-            <w:pPr>
-              <w:spacing w:before="80" w:after="20"/>
-            </w:pPr>
-            <w:r>
-              <w:rPr>
-                <w:rFonts w:ascii="Aptos" w:hAnsi="Aptos"/>
-                <w:b/>
-                <w:color w:val="16283F"/>
-                <w:sz w:val="18"/>
-              </w:rPr>
-              <w:t>Técnico de Nivel Medio en Electrónica</w:t>
-            </w:r>
-            <w:r>
-              <w:rPr>
-                <w:rFonts w:ascii="Aptos" w:hAnsi="Aptos"/>
-                <w:b/>
-                <w:color w:val="1677A8"/>
-                <w:sz w:val="16"/>
-              </w:rPr>
-              <w:t xml:space="preserve">  |  Titulado 2015</w:t>
-            </w:r>
-          </w:p>
-          <w:p>
-            <w:pPr>
-              <w:spacing w:after="60" w:line="252" w:lineRule="auto"/>
-            </w:pPr>
-            <w:r>
-              <w:rPr>
-                <w:rFonts w:ascii="Aptos" w:hAnsi="Aptos"/>
-                <w:b w:val="0"/>
-                <w:color w:val="5C6B78"/>
-                <w:sz w:val="16"/>
-              </w:rPr>
-              <w:t>Liceo Bicentenario Claudio Arrau León · 2013–2015</w:t>
-            </w:r>
-          </w:p>
-          <w:p>
-            <w:pPr>
-              <w:spacing w:before="160" w:after="100"/>
-              <w:pBdr>
-                <w:bottom w:val="single" w:sz="8" w:space="3" w:color="1677A8"/>
-              </w:pBdr>
-            </w:pPr>
-            <w:r>
-              <w:rPr>
-                <w:rFonts w:ascii="Aptos" w:hAnsi="Aptos"/>
-                <w:b/>
-                <w:color w:val="1677A8"/>
-                <w:sz w:val="18"/>
-              </w:rPr>
-              <w:t>ESPECIALIZACIONES</w:t>
-            </w:r>
-          </w:p>
-          <w:p>
-            <w:pPr>
-              <w:pStyle w:val="CVBullet"/>
-              <w:spacing w:after="40"/>
-            </w:pPr>
-            <w:r>
-              <w:rPr>
-                <w:rFonts w:ascii="Aptos" w:hAnsi="Aptos"/>
-                <w:b w:val="0"/>
-                <w:color w:val="263442"/>
-                <w:sz w:val="17"/>
-              </w:rPr>
-              <w:t>Infraestructura TI Segura · 2026</w:t>
-            </w:r>
-          </w:p>
-          <w:p>
-            <w:pPr>
-              <w:pStyle w:val="CVBullet"/>
-              <w:spacing w:after="40"/>
-            </w:pPr>
-            <w:r>
-              <w:rPr>
-                <w:rFonts w:ascii="Aptos" w:hAnsi="Aptos"/>
-                <w:b w:val="0"/>
-                <w:color w:val="263442"/>
-                <w:sz w:val="17"/>
-              </w:rPr>
-              <w:t>Desarrollador Full Stack · 2026</w:t>
-            </w:r>
-          </w:p>
-          <w:p>
-            <w:pPr>
-              <w:pStyle w:val="CVBullet"/>
-              <w:spacing w:after="40"/>
-            </w:pPr>
-            <w:r>
-              <w:rPr>
-                <w:rFonts w:ascii="Aptos" w:hAnsi="Aptos"/>
-                <w:b w:val="0"/>
-                <w:color w:val="263442"/>
-                <w:sz w:val="17"/>
-              </w:rPr>
-              <w:t>Desarrollo de Aplicaciones Iniciales · 2025</w:t>
+              <w:t>portfolio-page-for-ui-developer-two-beige.vercel.app</w:t>
             </w:r>
           </w:p>
         </w:tc>
         <w:tc>
           <w:tcPr>
-            <w:tcW w:type="dxa" w:w="5371"/>
+            <w:tcW w:type="dxa" w:w="5515"/>
+            <w:vAlign w:val="top"/>
             <w:tcMar>
-              <w:top w:w="120" w:type="dxa"/>
-              <w:start w:w="230" w:type="dxa"/>
-              <w:bottom w:w="120" w:type="dxa"/>
-              <w:end w:w="180" w:type="dxa"/>
+              <w:top w:w="65" w:type="dxa"/>
+              <w:start w:w="130" w:type="dxa"/>
+              <w:bottom w:w="50" w:type="dxa"/>
+              <w:end w:w="80" w:type="dxa"/>
             </w:tcMar>
-            <w:vAlign w:val="top"/>
             <w:tcBorders>
               <w:top w:val="nil"/>
+              <w:left w:val="nil"/>
               <w:bottom w:val="nil"/>
-              <w:start w:val="nil"/>
-              <w:end w:val="nil"/>
+              <w:right w:val="nil"/>
+              <w:insideH w:val="nil"/>
+              <w:insideV w:val="nil"/>
             </w:tcBorders>
           </w:tcPr>
           <w:p/>
           <w:p>
             <w:pPr>
-              <w:spacing w:before="160" w:after="100"/>
-              <w:pBdr>
-                <w:bottom w:val="single" w:sz="8" w:space="3" w:color="1677A8"/>
-              </w:pBdr>
+              <w:keepNext/>
+              <w:spacing w:before="0" w:after="40" w:line="240" w:lineRule="auto"/>
             </w:pPr>
             <w:r>
               <w:rPr>
-                <w:rFonts w:ascii="Aptos" w:hAnsi="Aptos"/>
+                <w:rFonts w:ascii="Arial" w:hAnsi="Arial"/>
                 <w:b/>
-                <w:color w:val="1677A8"/>
-                <w:sz w:val="18"/>
-              </w:rPr>
-              <w:t>PERFIL PROFESIONAL</w:t>
-            </w:r>
-          </w:p>
-          <w:p>
-            <w:pPr>
-              <w:spacing w:line="269" w:lineRule="auto" w:after="100"/>
-            </w:pPr>
-            <w:r>
-              <w:rPr>
-                <w:rFonts w:ascii="Aptos" w:hAnsi="Aptos"/>
-                <w:b w:val="0"/>
-                <w:color w:val="263442"/>
-                <w:sz w:val="18"/>
-              </w:rPr>
-              <w:t>Desarrollador Full Stack y Técnico de Nivel Superior Analista Programador, actualmente cursando Ingeniería en Informática. Experiencia construyendo aplicaciones web, colaborando mediante Git/GitHub, desplegando soluciones y resolviendo incidencias técnicas. Proactivo, adaptable y orientado al aprendizaje práctico, con experiencia integrando inteligencia artificial, LLMs y agentes de IA.</w:t>
-            </w:r>
-          </w:p>
-          <w:p>
-            <w:pPr>
-              <w:spacing w:before="160" w:after="100"/>
-              <w:pBdr>
-                <w:bottom w:val="single" w:sz="8" w:space="3" w:color="1677A8"/>
-              </w:pBdr>
-            </w:pPr>
-            <w:r>
-              <w:rPr>
-                <w:rFonts w:ascii="Aptos" w:hAnsi="Aptos"/>
-                <w:b/>
-                <w:color w:val="1677A8"/>
-                <w:sz w:val="18"/>
-              </w:rPr>
-              <w:t>EXPERIENCIA PROFESIONAL</w:t>
-            </w:r>
-          </w:p>
-          <w:p>
-            <w:pPr>
-              <w:spacing w:before="80" w:after="20"/>
-            </w:pPr>
-            <w:r>
-              <w:rPr>
-                <w:rFonts w:ascii="Aptos" w:hAnsi="Aptos"/>
-                <w:b/>
-                <w:color w:val="16283F"/>
-                <w:sz w:val="18"/>
-              </w:rPr>
-              <w:t>Alpha Docere SPA</w:t>
-            </w:r>
-            <w:r>
-              <w:rPr>
-                <w:rFonts w:ascii="Aptos" w:hAnsi="Aptos"/>
-                <w:b/>
-                <w:color w:val="1677A8"/>
-                <w:sz w:val="16"/>
-              </w:rPr>
-              <w:t xml:space="preserve">  |  Técnico Analista Programador · Práctica profesional | Mar 2026 – May 2026</w:t>
-            </w:r>
-          </w:p>
-          <w:p>
-            <w:pPr>
-              <w:spacing w:after="60" w:line="252" w:lineRule="auto"/>
-            </w:pPr>
-            <w:r>
-              <w:rPr>
-                <w:rFonts w:ascii="Aptos" w:hAnsi="Aptos"/>
-                <w:b w:val="0"/>
-                <w:color w:val="5C6B78"/>
-                <w:sz w:val="16"/>
-              </w:rPr>
-              <w:t>Desarrollo y mantenimiento de soluciones web; trabajo con ramas en Git/GitHub; Scrum y Sprints; despliegues mediante cPanel; integración de IA y documentación técnica.</w:t>
-            </w:r>
-          </w:p>
-          <w:p>
-            <w:pPr>
-              <w:spacing w:before="80" w:after="20"/>
-            </w:pPr>
-            <w:r>
-              <w:rPr>
-                <w:rFonts w:ascii="Aptos" w:hAnsi="Aptos"/>
-                <w:b/>
-                <w:color w:val="16283F"/>
-                <w:sz w:val="18"/>
-              </w:rPr>
-              <w:t>Teltronic</w:t>
-            </w:r>
-            <w:r>
-              <w:rPr>
-                <w:rFonts w:ascii="Aptos" w:hAnsi="Aptos"/>
-                <w:b/>
-                <w:color w:val="1677A8"/>
-                <w:sz w:val="16"/>
-              </w:rPr>
-              <w:t xml:space="preserve">  |  Técnico de Soporte Informático | Dic 2014 – Abr 2015</w:t>
-            </w:r>
-          </w:p>
-          <w:p>
-            <w:pPr>
-              <w:spacing w:after="60" w:line="252" w:lineRule="auto"/>
-            </w:pPr>
-            <w:r>
-              <w:rPr>
-                <w:rFonts w:ascii="Aptos" w:hAnsi="Aptos"/>
-                <w:b w:val="0"/>
-                <w:color w:val="5C6B78"/>
-                <w:sz w:val="16"/>
-              </w:rPr>
-              <w:t>Soporte de hardware y software, instalación y configuración de internet, atención de requerimientos y resolución de incidencias.</w:t>
-            </w:r>
-          </w:p>
-          <w:p>
-            <w:pPr>
-              <w:spacing w:before="160" w:after="100"/>
-              <w:pBdr>
-                <w:bottom w:val="single" w:sz="8" w:space="3" w:color="1677A8"/>
-              </w:pBdr>
-            </w:pPr>
-            <w:r>
-              <w:rPr>
-                <w:rFonts w:ascii="Aptos" w:hAnsi="Aptos"/>
-                <w:b/>
-                <w:color w:val="1677A8"/>
+                <w:color w:val="1677A3"/>
                 <w:sz w:val="18"/>
               </w:rPr>
               <w:t>PROYECTOS DESTACADOS</w:t>
@@ -810,394 +641,307 @@
           </w:p>
           <w:p>
             <w:pPr>
-              <w:spacing w:before="80" w:after="20"/>
+              <w:spacing w:before="32" w:after="4" w:line="240" w:lineRule="auto"/>
             </w:pPr>
             <w:r>
               <w:rPr>
-                <w:rFonts w:ascii="Aptos" w:hAnsi="Aptos"/>
+                <w:rFonts w:ascii="Arial" w:hAnsi="Arial"/>
                 <w:b/>
-                <w:color w:val="16283F"/>
-                <w:sz w:val="18"/>
+                <w:color w:val="1F2937"/>
+                <w:sz w:val="16"/>
               </w:rPr>
               <w:t>Kreative Vit</w:t>
             </w:r>
             <w:r>
               <w:rPr>
-                <w:rFonts w:ascii="Aptos" w:hAnsi="Aptos"/>
+                <w:rFonts w:ascii="Arial" w:hAnsi="Arial"/>
                 <w:b/>
-                <w:color w:val="1677A8"/>
-                <w:sz w:val="16"/>
+                <w:color w:val="1677A3"/>
+                <w:sz w:val="14"/>
               </w:rPr>
-              <w:t xml:space="preserve">  |  Desarrollo completo</w:t>
+              <w:t xml:space="preserve">  ·  Desarrollo completo</w:t>
             </w:r>
           </w:p>
           <w:p>
             <w:pPr>
-              <w:spacing w:after="60" w:line="252" w:lineRule="auto"/>
+              <w:spacing w:before="0" w:after="10" w:line="240" w:lineRule="auto"/>
             </w:pPr>
             <w:r>
               <w:rPr>
-                <w:rFonts w:ascii="Aptos" w:hAnsi="Aptos"/>
+                <w:rFonts w:ascii="Arial" w:hAnsi="Arial"/>
                 <w:b w:val="0"/>
-                <w:color w:val="5C6B78"/>
-                <w:sz w:val="16"/>
+                <w:color w:val="4B5563"/>
+                <w:sz w:val="14"/>
               </w:rPr>
-              <w:t>Plataforma de bienestar y productividad con bitácora, seguimiento emocional, alertas, panel de líderes y gamificación. React, Vite, PHP y MySQL.</w:t>
+              <w:t>Plataforma de bienestar y productividad con bitácora, seguimiento emocional, paneles y alertas.</w:t>
+            </w:r>
+            <w:r>
+              <w:rPr>
+                <w:rFonts w:ascii="Arial" w:hAnsi="Arial"/>
+                <w:b/>
+                <w:color w:val="1F2937"/>
+                <w:sz w:val="14"/>
+              </w:rPr>
+              <w:t xml:space="preserve">  |  React · Vite · PHP · MySQL</w:t>
             </w:r>
           </w:p>
           <w:p>
             <w:pPr>
-              <w:spacing w:before="80" w:after="20"/>
+              <w:spacing w:before="32" w:after="4" w:line="240" w:lineRule="auto"/>
             </w:pPr>
             <w:r>
               <w:rPr>
-                <w:rFonts w:ascii="Aptos" w:hAnsi="Aptos"/>
+                <w:rFonts w:ascii="Arial" w:hAnsi="Arial"/>
                 <w:b/>
-                <w:color w:val="16283F"/>
-                <w:sz w:val="18"/>
+                <w:color w:val="1F2937"/>
+                <w:sz w:val="16"/>
               </w:rPr>
               <w:t>Austral Collector</w:t>
             </w:r>
             <w:r>
               <w:rPr>
-                <w:rFonts w:ascii="Aptos" w:hAnsi="Aptos"/>
+                <w:rFonts w:ascii="Arial" w:hAnsi="Arial"/>
                 <w:b/>
-                <w:color w:val="1677A8"/>
-                <w:sz w:val="16"/>
+                <w:color w:val="1677A3"/>
+                <w:sz w:val="14"/>
               </w:rPr>
-              <w:t xml:space="preserve">  |  Desarrollo completo para cliente</w:t>
+              <w:t xml:space="preserve">  ·  Desarrollo completo</w:t>
             </w:r>
           </w:p>
           <w:p>
             <w:pPr>
-              <w:spacing w:after="60" w:line="252" w:lineRule="auto"/>
+              <w:spacing w:before="0" w:after="10" w:line="240" w:lineRule="auto"/>
             </w:pPr>
             <w:r>
               <w:rPr>
-                <w:rFonts w:ascii="Aptos" w:hAnsi="Aptos"/>
+                <w:rFonts w:ascii="Arial" w:hAnsi="Arial"/>
                 <w:b w:val="0"/>
-                <w:color w:val="5C6B78"/>
-                <w:sz w:val="16"/>
+                <w:color w:val="4B5563"/>
+                <w:sz w:val="14"/>
               </w:rPr>
-              <w:t>PWA para coleccionistas chilenos de figuras vintage y juguetes retro. React, PHP y MySQL.</w:t>
+              <w:t>Plataforma PWA para una comunidad chilena de coleccionistas de figuras vintage y juguetes retro.</w:t>
+            </w:r>
+            <w:r>
+              <w:rPr>
+                <w:rFonts w:ascii="Arial" w:hAnsi="Arial"/>
+                <w:b/>
+                <w:color w:val="1F2937"/>
+                <w:sz w:val="14"/>
+              </w:rPr>
+              <w:t xml:space="preserve">  |  React · PHP · MySQL · PWA</w:t>
             </w:r>
           </w:p>
           <w:p>
             <w:pPr>
-              <w:spacing w:before="80" w:after="20"/>
+              <w:spacing w:before="32" w:after="4" w:line="240" w:lineRule="auto"/>
             </w:pPr>
             <w:r>
               <w:rPr>
-                <w:rFonts w:ascii="Aptos" w:hAnsi="Aptos"/>
+                <w:rFonts w:ascii="Arial" w:hAnsi="Arial"/>
                 <w:b/>
-                <w:color w:val="16283F"/>
-                <w:sz w:val="18"/>
+                <w:color w:val="1F2937"/>
+                <w:sz w:val="16"/>
               </w:rPr>
               <w:t>HR Copilot Chile</w:t>
             </w:r>
             <w:r>
               <w:rPr>
-                <w:rFonts w:ascii="Aptos" w:hAnsi="Aptos"/>
+                <w:rFonts w:ascii="Arial" w:hAnsi="Arial"/>
                 <w:b/>
-                <w:color w:val="1677A8"/>
-                <w:sz w:val="16"/>
+                <w:color w:val="1677A3"/>
+                <w:sz w:val="14"/>
               </w:rPr>
-              <w:t xml:space="preserve">  |  Desarrollo completo</w:t>
+              <w:t xml:space="preserve">  ·  Desarrollo completo</w:t>
             </w:r>
           </w:p>
           <w:p>
             <w:pPr>
-              <w:spacing w:after="60" w:line="252" w:lineRule="auto"/>
+              <w:spacing w:before="0" w:after="10" w:line="240" w:lineRule="auto"/>
             </w:pPr>
             <w:r>
               <w:rPr>
-                <w:rFonts w:ascii="Aptos" w:hAnsi="Aptos"/>
+                <w:rFonts w:ascii="Arial" w:hAnsi="Arial"/>
                 <w:b w:val="0"/>
-                <w:color w:val="5C6B78"/>
-                <w:sz w:val="16"/>
+                <w:color w:val="4B5563"/>
+                <w:sz w:val="14"/>
               </w:rPr>
-              <w:t>Asistente de RR. HH. con IA para el contexto laboral chileno. Next.js, TypeScript e IA.</w:t>
+              <w:t>Asistente inteligente para consultas sobre el contexto laboral chileno.</w:t>
+            </w:r>
+            <w:r>
+              <w:rPr>
+                <w:rFonts w:ascii="Arial" w:hAnsi="Arial"/>
+                <w:b/>
+                <w:color w:val="1F2937"/>
+                <w:sz w:val="14"/>
+              </w:rPr>
+              <w:t xml:space="preserve">  |  Next.js · TypeScript · IA</w:t>
             </w:r>
           </w:p>
           <w:p>
             <w:pPr>
-              <w:spacing w:before="80" w:after="20"/>
+              <w:spacing w:before="32" w:after="4" w:line="240" w:lineRule="auto"/>
             </w:pPr>
             <w:r>
               <w:rPr>
-                <w:rFonts w:ascii="Aptos" w:hAnsi="Aptos"/>
+                <w:rFonts w:ascii="Arial" w:hAnsi="Arial"/>
                 <w:b/>
-                <w:color w:val="16283F"/>
-                <w:sz w:val="18"/>
+                <w:color w:val="1F2937"/>
+                <w:sz w:val="16"/>
               </w:rPr>
               <w:t>Kreative · Perfiles Web</w:t>
             </w:r>
             <w:r>
               <w:rPr>
-                <w:rFonts w:ascii="Aptos" w:hAnsi="Aptos"/>
+                <w:rFonts w:ascii="Arial" w:hAnsi="Arial"/>
                 <w:b/>
-                <w:color w:val="1677A8"/>
-                <w:sz w:val="16"/>
+                <w:color w:val="1677A3"/>
+                <w:sz w:val="14"/>
               </w:rPr>
-              <w:t xml:space="preserve">  |  Contribución técnica</w:t>
+              <w:t xml:space="preserve">  ·  Contribución técnica</w:t>
             </w:r>
           </w:p>
           <w:p>
             <w:pPr>
-              <w:spacing w:after="60" w:line="252" w:lineRule="auto"/>
+              <w:spacing w:before="0" w:after="10" w:line="240" w:lineRule="auto"/>
             </w:pPr>
             <w:r>
               <w:rPr>
-                <w:rFonts w:ascii="Aptos" w:hAnsi="Aptos"/>
+                <w:rFonts w:ascii="Arial" w:hAnsi="Arial"/>
                 <w:b w:val="0"/>
-                <w:color w:val="5C6B78"/>
-                <w:sz w:val="16"/>
+                <w:color w:val="4B5563"/>
+                <w:sz w:val="14"/>
               </w:rPr>
-              <w:t>Correcciones de frontend y mejoras en perfiles y onboarding mediante ramas de trabajo.</w:t>
+              <w:t>Correcciones de frontend y mejoras en los flujos de perfiles y onboarding.</w:t>
+            </w:r>
+            <w:r>
+              <w:rPr>
+                <w:rFonts w:ascii="Arial" w:hAnsi="Arial"/>
+                <w:b/>
+                <w:color w:val="1F2937"/>
+                <w:sz w:val="14"/>
+              </w:rPr>
+              <w:t xml:space="preserve">  |  JavaScript · PHP · MySQL · Bootstrap</w:t>
             </w:r>
           </w:p>
           <w:p>
             <w:pPr>
-              <w:spacing w:before="80" w:after="20"/>
+              <w:spacing w:before="32" w:after="4" w:line="240" w:lineRule="auto"/>
             </w:pPr>
             <w:r>
               <w:rPr>
-                <w:rFonts w:ascii="Aptos" w:hAnsi="Aptos"/>
+                <w:rFonts w:ascii="Arial" w:hAnsi="Arial"/>
                 <w:b/>
-                <w:color w:val="16283F"/>
-                <w:sz w:val="18"/>
+                <w:color w:val="1F2937"/>
+                <w:sz w:val="16"/>
               </w:rPr>
               <w:t>Wiki Kreative</w:t>
             </w:r>
             <w:r>
               <w:rPr>
-                <w:rFonts w:ascii="Aptos" w:hAnsi="Aptos"/>
+                <w:rFonts w:ascii="Arial" w:hAnsi="Arial"/>
                 <w:b/>
-                <w:color w:val="1677A8"/>
-                <w:sz w:val="16"/>
+                <w:color w:val="1677A3"/>
+                <w:sz w:val="14"/>
               </w:rPr>
-              <w:t xml:space="preserve">  |  Contribución técnica</w:t>
+              <w:t xml:space="preserve">  ·  Contribución técnica</w:t>
             </w:r>
           </w:p>
           <w:p>
             <w:pPr>
-              <w:spacing w:after="60" w:line="252" w:lineRule="auto"/>
+              <w:spacing w:before="0" w:after="10" w:line="240" w:lineRule="auto"/>
             </w:pPr>
             <w:r>
               <w:rPr>
-                <w:rFonts w:ascii="Aptos" w:hAnsi="Aptos"/>
+                <w:rFonts w:ascii="Arial" w:hAnsi="Arial"/>
                 <w:b w:val="0"/>
-                <w:color w:val="5C6B78"/>
-                <w:sz w:val="16"/>
+                <w:color w:val="4B5563"/>
+                <w:sz w:val="14"/>
               </w:rPr>
-              <w:t>Correcciones y funcionalidades en publicaciones, filtros, rutas, roles y autenticación JWT.</w:t>
+              <w:t>Mejoras en publicaciones, filtros, rutas, roles y autenticación.</w:t>
+            </w:r>
+            <w:r>
+              <w:rPr>
+                <w:rFonts w:ascii="Arial" w:hAnsi="Arial"/>
+                <w:b/>
+                <w:color w:val="1F2937"/>
+                <w:sz w:val="14"/>
+              </w:rPr>
+              <w:t xml:space="preserve">  |  PHP MVC · JavaScript · MySQL · JWT</w:t>
             </w:r>
           </w:p>
           <w:p>
             <w:pPr>
-              <w:spacing w:before="80" w:after="20"/>
+              <w:spacing w:before="32" w:after="4" w:line="240" w:lineRule="auto"/>
             </w:pPr>
             <w:r>
               <w:rPr>
-                <w:rFonts w:ascii="Aptos" w:hAnsi="Aptos"/>
+                <w:rFonts w:ascii="Arial" w:hAnsi="Arial"/>
                 <w:b/>
-                <w:color w:val="16283F"/>
-                <w:sz w:val="18"/>
+                <w:color w:val="1F2937"/>
+                <w:sz w:val="16"/>
               </w:rPr>
               <w:t>Sistema Auth Alpha Docere</w:t>
             </w:r>
             <w:r>
               <w:rPr>
-                <w:rFonts w:ascii="Aptos" w:hAnsi="Aptos"/>
+                <w:rFonts w:ascii="Arial" w:hAnsi="Arial"/>
                 <w:b/>
-                <w:color w:val="1677A8"/>
-                <w:sz w:val="16"/>
+                <w:color w:val="1677A3"/>
+                <w:sz w:val="14"/>
               </w:rPr>
-              <w:t xml:space="preserve">  |  Contribución técnica</w:t>
+              <w:t xml:space="preserve">  ·  Contribución técnica</w:t>
             </w:r>
           </w:p>
           <w:p>
             <w:pPr>
-              <w:spacing w:after="60" w:line="252" w:lineRule="auto"/>
+              <w:spacing w:before="0" w:after="10" w:line="240" w:lineRule="auto"/>
             </w:pPr>
             <w:r>
               <w:rPr>
-                <w:rFonts w:ascii="Aptos" w:hAnsi="Aptos"/>
+                <w:rFonts w:ascii="Arial" w:hAnsi="Arial"/>
                 <w:b w:val="0"/>
-                <w:color w:val="5C6B78"/>
-                <w:sz w:val="16"/>
+                <w:color w:val="4B5563"/>
+                <w:sz w:val="14"/>
               </w:rPr>
-              <w:t>Soporte e integración de registro, acceso, rutas protegidas y verificación por correo.</w:t>
+              <w:t>Correcciones e integración de registro, acceso, rutas protegidas y verificación por correo.</w:t>
+            </w:r>
+            <w:r>
+              <w:rPr>
+                <w:rFonts w:ascii="Arial" w:hAnsi="Arial"/>
+                <w:b/>
+                <w:color w:val="1F2937"/>
+                <w:sz w:val="14"/>
+              </w:rPr>
+              <w:t xml:space="preserve">  |  JWT · PHP · Email · MySQL</w:t>
             </w:r>
           </w:p>
           <w:p>
             <w:pPr>
-              <w:spacing w:before="160" w:after="100"/>
-              <w:pBdr>
-                <w:bottom w:val="single" w:sz="8" w:space="3" w:color="1677A8"/>
-              </w:pBdr>
+              <w:keepNext/>
+              <w:spacing w:before="100" w:after="40" w:line="240" w:lineRule="auto"/>
             </w:pPr>
             <w:r>
               <w:rPr>
-                <w:rFonts w:ascii="Aptos" w:hAnsi="Aptos"/>
+                <w:rFonts w:ascii="Arial" w:hAnsi="Arial"/>
                 <w:b/>
-                <w:color w:val="1677A8"/>
+                <w:color w:val="1677A3"/>
                 <w:sz w:val="18"/>
               </w:rPr>
-              <w:t>PORTAFOLIO PROFESIONAL</w:t>
+              <w:t>ENFOQUE PROFESIONAL</w:t>
             </w:r>
           </w:p>
           <w:p>
             <w:pPr>
-              <w:spacing w:after="120"/>
+              <w:spacing w:before="0" w:after="0" w:line="240" w:lineRule="auto"/>
             </w:pPr>
             <w:r>
               <w:rPr>
-                <w:rFonts w:ascii="Aptos" w:hAnsi="Aptos"/>
-                <w:b/>
-                <w:color w:val="16283F"/>
-                <w:sz w:val="17"/>
+                <w:rFonts w:ascii="Arial" w:hAnsi="Arial"/>
+                <w:b w:val="0"/>
+                <w:color w:val="4B5563"/>
+                <w:sz w:val="15"/>
               </w:rPr>
-              <w:t>Proyectos, experiencia y contacto</w:t>
-              <w:br/>
-            </w:r>
-            <w:r>
-              <w:rPr>
-                <w:rFonts w:ascii="Aptos" w:hAnsi="Aptos"/>
-                <w:b w:val="0"/>
-                <w:color w:val="1677A8"/>
-                <w:sz w:val="16"/>
-              </w:rPr>
-              <w:t>https://portfolio-page-for-ui-developer-two-beige.vercel.app</w:t>
-            </w:r>
-          </w:p>
-          <w:p>
-            <w:pPr>
-              <w:spacing w:before="160" w:after="100"/>
-              <w:pBdr>
-                <w:bottom w:val="single" w:sz="8" w:space="3" w:color="1677A8"/>
-              </w:pBdr>
-            </w:pPr>
-            <w:r>
-              <w:rPr>
-                <w:rFonts w:ascii="Aptos" w:hAnsi="Aptos"/>
-                <w:b/>
-                <w:color w:val="1677A8"/>
-                <w:sz w:val="18"/>
-              </w:rPr>
-              <w:t>EXPERIENCIA COMPLEMENTARIA</w:t>
-            </w:r>
-          </w:p>
-          <w:p>
-            <w:pPr>
-              <w:spacing w:before="80" w:after="20"/>
-            </w:pPr>
-            <w:r>
-              <w:rPr>
-                <w:rFonts w:ascii="Aptos" w:hAnsi="Aptos"/>
-                <w:b/>
-                <w:color w:val="16283F"/>
-                <w:sz w:val="18"/>
-              </w:rPr>
-              <w:t>GL Electric · Electricista | Jun 2025 – Presente</w:t>
-            </w:r>
-          </w:p>
-          <w:p>
-            <w:pPr>
-              <w:spacing w:after="60" w:line="252" w:lineRule="auto"/>
-            </w:pPr>
-            <w:r>
-              <w:rPr>
-                <w:rFonts w:ascii="Aptos" w:hAnsi="Aptos"/>
-                <w:b w:val="0"/>
-                <w:color w:val="5C6B78"/>
-                <w:sz w:val="16"/>
-              </w:rPr>
-              <w:t>Instalación y mantenimiento eléctrico, trabajo en terreno y coordinación de tareas.</w:t>
-            </w:r>
-          </w:p>
-          <w:p>
-            <w:pPr>
-              <w:spacing w:before="80" w:after="20"/>
-            </w:pPr>
-            <w:r>
-              <w:rPr>
-                <w:rFonts w:ascii="Aptos" w:hAnsi="Aptos"/>
-                <w:b/>
-                <w:color w:val="16283F"/>
-                <w:sz w:val="18"/>
-              </w:rPr>
-              <w:t>Recolector y Reponedor | 2018 – 2024</w:t>
-            </w:r>
-          </w:p>
-          <w:p>
-            <w:pPr>
-              <w:spacing w:after="60" w:line="252" w:lineRule="auto"/>
-            </w:pPr>
-            <w:r>
-              <w:rPr>
-                <w:rFonts w:ascii="Aptos" w:hAnsi="Aptos"/>
-                <w:b w:val="0"/>
-                <w:color w:val="5C6B78"/>
-                <w:sz w:val="16"/>
-              </w:rPr>
-              <w:t>Reposición, atención al cliente y cumplimiento de objetivos.</w:t>
-            </w:r>
-          </w:p>
-          <w:p>
-            <w:pPr>
-              <w:spacing w:before="80" w:after="20"/>
-            </w:pPr>
-            <w:r>
-              <w:rPr>
-                <w:rFonts w:ascii="Aptos" w:hAnsi="Aptos"/>
-                <w:b/>
-                <w:color w:val="16283F"/>
-                <w:sz w:val="18"/>
-              </w:rPr>
-              <w:t>Carsol Fruit S.A. · Supervisor de Cámaras de Frío</w:t>
-            </w:r>
-          </w:p>
-          <w:p>
-            <w:pPr>
-              <w:spacing w:after="60" w:line="252" w:lineRule="auto"/>
-            </w:pPr>
-            <w:r>
-              <w:rPr>
-                <w:rFonts w:ascii="Aptos" w:hAnsi="Aptos"/>
-                <w:b w:val="0"/>
-                <w:color w:val="5C6B78"/>
-                <w:sz w:val="16"/>
-              </w:rPr>
-              <w:t>Supervisión de operaciones, personal y control de procesos.</w:t>
-            </w:r>
-          </w:p>
-          <w:p>
-            <w:pPr>
-              <w:spacing w:before="80" w:after="20"/>
-            </w:pPr>
-            <w:r>
-              <w:rPr>
-                <w:rFonts w:ascii="Aptos" w:hAnsi="Aptos"/>
-                <w:b/>
-                <w:color w:val="16283F"/>
-                <w:sz w:val="18"/>
-              </w:rPr>
-              <w:t>Santa Sofía Ltda. · Bodeguero</w:t>
-            </w:r>
-          </w:p>
-          <w:p>
-            <w:pPr>
-              <w:spacing w:after="60" w:line="252" w:lineRule="auto"/>
-            </w:pPr>
-            <w:r>
-              <w:rPr>
-                <w:rFonts w:ascii="Aptos" w:hAnsi="Aptos"/>
-                <w:b w:val="0"/>
-                <w:color w:val="5C6B78"/>
-                <w:sz w:val="16"/>
-              </w:rPr>
-              <w:t>Recepción, organización, despacho y control de inventario.</w:t>
+              <w:t>Busco integrarme a un equipo donde pueda aportar en desarrollo web, resolución técnica y construcción de productos útiles, mientras continúo creciendo profesionalmente.</w:t>
             </w:r>
           </w:p>
         </w:tc>
@@ -1205,8 +949,8 @@
     </w:tbl>
     <w:sectPr>
       <w:footerReference w:type="default" r:id="rId9"/>
-      <w:pgSz w:w="11952" w:h="16848"/>
-      <w:pgMar w:top="605" w:right="605" w:bottom="605" w:left="605" w:header="720" w:footer="720" w:gutter="0"/>
+      <w:pgSz w:w="12240" w:h="15840"/>
+      <w:pgMar w:top="461" w:right="605" w:bottom="461" w:left="605" w:header="144" w:footer="144" w:gutter="0"/>
       <w:cols w:space="720"/>
       <w:docGrid w:linePitch="360"/>
     </w:sectPr>
@@ -1219,16 +963,17 @@
   <w:p>
     <w:pPr>
       <w:pStyle w:val="Footer"/>
+      <w:spacing w:before="0" w:after="0" w:line="240" w:lineRule="auto"/>
       <w:jc w:val="center"/>
     </w:pPr>
     <w:r>
       <w:rPr>
-        <w:rFonts w:ascii="Aptos" w:hAnsi="Aptos"/>
+        <w:rFonts w:ascii="Arial" w:hAnsi="Arial"/>
         <w:b w:val="0"/>
-        <w:color w:val="5C6B78"/>
-        <w:sz w:val="16"/>
-      </w:rPr>
-      <w:t>José Eliecer Rivera Pérez  ·  Curriculum Vitae 2026</w:t>
+        <w:color w:val="4B5563"/>
+        <w:sz w:val="14"/>
+      </w:rPr>
+      <w:t>José Eliecer Rivera  ·  CV 2026</w:t>
     </w:r>
   </w:p>
 </w:ftr>
@@ -1598,12 +1343,11 @@
     <w:qFormat/>
     <w:rsid w:val="00FC693F"/>
     <w:pPr>
-      <w:spacing w:after="60"/>
+      <w:spacing w:after="0"/>
     </w:pPr>
     <w:rPr>
-      <w:rFonts w:ascii="Aptos" w:hAnsi="Aptos"/>
-      <w:color w:val="263442"/>
-      <w:sz w:val="18"/>
+      <w:rFonts w:ascii="Arial" w:hAnsi="Arial"/>
+      <w:sz w:val="16"/>
     </w:rPr>
   </w:style>
   <w:style w:type="paragraph" w:styleId="Header">
@@ -13287,16 +13031,6 @@
         <w:shd w:val="clear" w:color="auto" w:fill="FBCAA2" w:themeFill="accent6" w:themeFillTint="7F"/>
       </w:tcPr>
     </w:tblStylePr>
-  </w:style>
-  <w:style w:type="paragraph" w:customStyle="1" w:styleId="CVBullet">
-    <w:name w:val="CV Bullet"/>
-    <w:pPr>
-      <w:ind w:left="187" w:hanging="144"/>
-    </w:pPr>
-    <w:rPr>
-      <w:rFonts w:ascii="Aptos" w:hAnsi="Aptos"/>
-      <w:sz w:val="17"/>
-    </w:rPr>
   </w:style>
 </w:styles>
 </file>

</xml_diff>

<commit_message>
chore: update CV document for Jose Eliecer Rivera 2026
</commit_message>
<xml_diff>
--- a/public/CV_Jose_Eliecer_Rivera_2026.docx
+++ b/public/CV_Jose_Eliecer_Rivera_2026.docx
@@ -10,118 +10,93 @@
         <w:tblLook w:firstColumn="1" w:firstRow="1" w:lastColumn="0" w:lastRow="0" w:noHBand="0" w:noVBand="1" w:val="04A0"/>
       </w:tblPr>
       <w:tblGrid>
-        <w:gridCol w:w="6912"/>
-        <w:gridCol w:w="3744"/>
+        <w:gridCol w:w="6768"/>
+        <w:gridCol w:w="3672"/>
       </w:tblGrid>
       <w:tr>
         <w:tc>
           <w:tcPr>
-            <w:tcW w:type="dxa" w:w="5515"/>
-            <w:shd w:fill="172A3A"/>
+            <w:tcW w:type="dxa" w:w="5371"/>
+            <w:shd w:fill="17324D"/>
             <w:tcMar>
-              <w:top w:w="110" w:type="dxa"/>
-              <w:start w:w="170" w:type="dxa"/>
-              <w:bottom w:w="100" w:type="dxa"/>
-              <w:end w:w="100" w:type="dxa"/>
+              <w:top w:w="120" w:type="dxa"/>
+              <w:start w:w="155" w:type="dxa"/>
+              <w:bottom w:w="115" w:type="dxa"/>
+              <w:end w:w="155" w:type="dxa"/>
             </w:tcMar>
-            <w:tcBorders>
-              <w:top w:val="nil"/>
-              <w:left w:val="nil"/>
-              <w:bottom w:val="nil"/>
-              <w:right w:val="nil"/>
-              <w:insideH w:val="nil"/>
-              <w:insideV w:val="nil"/>
-            </w:tcBorders>
+            <w:vAlign w:val="center"/>
           </w:tcPr>
           <w:p>
             <w:pPr>
-              <w:spacing w:before="0" w:after="0" w:line="240" w:lineRule="auto"/>
+              <w:spacing w:after="40"/>
             </w:pPr>
             <w:r>
               <w:rPr>
-                <w:rFonts w:ascii="Arial" w:hAnsi="Arial"/>
                 <w:b/>
                 <w:color w:val="FFFFFF"/>
-                <w:sz w:val="38"/>
+                <w:sz w:val="40"/>
               </w:rPr>
               <w:t>JOSÉ ELIECER RIVERA</w:t>
             </w:r>
           </w:p>
           <w:p>
-            <w:pPr>
-              <w:spacing w:before="20" w:after="0" w:line="240" w:lineRule="auto"/>
-            </w:pPr>
             <w:r>
               <w:rPr>
-                <w:rFonts w:ascii="Arial" w:hAnsi="Arial"/>
                 <w:b/>
-                <w:color w:val="BEE1EF"/>
-                <w:sz w:val="16"/>
+                <w:color w:val="7DD3FC"/>
+                <w:sz w:val="18"/>
               </w:rPr>
-              <w:t>DESARROLLADOR FULL STACK  ·  TNS ANALISTA PROGRAMADOR</w:t>
+              <w:t>DESARROLLADOR FULL STACK  |  TNS ANALISTA PROGRAMADOR</w:t>
             </w:r>
           </w:p>
         </w:tc>
         <w:tc>
           <w:tcPr>
-            <w:tcW w:type="dxa" w:w="5515"/>
-            <w:shd w:fill="172A3A"/>
+            <w:tcW w:type="dxa" w:w="5371"/>
+            <w:shd w:fill="17324D"/>
             <w:tcMar>
-              <w:top w:w="110" w:type="dxa"/>
-              <w:start w:w="100" w:type="dxa"/>
-              <w:bottom w:w="100" w:type="dxa"/>
-              <w:end w:w="170" w:type="dxa"/>
+              <w:top w:w="120" w:type="dxa"/>
+              <w:start w:w="155" w:type="dxa"/>
+              <w:bottom w:w="115" w:type="dxa"/>
+              <w:end w:w="155" w:type="dxa"/>
             </w:tcMar>
-            <w:tcBorders>
-              <w:top w:val="nil"/>
-              <w:left w:val="nil"/>
-              <w:bottom w:val="nil"/>
-              <w:right w:val="nil"/>
-              <w:insideH w:val="nil"/>
-              <w:insideV w:val="nil"/>
-            </w:tcBorders>
+            <w:vAlign w:val="center"/>
           </w:tcPr>
           <w:p>
             <w:pPr>
-              <w:spacing w:before="0" w:after="0" w:line="240" w:lineRule="auto"/>
               <w:jc w:val="right"/>
             </w:pPr>
             <w:r>
               <w:rPr>
-                <w:rFonts w:ascii="Arial" w:hAnsi="Arial"/>
                 <w:b w:val="0"/>
                 <w:color w:val="FFFFFF"/>
-                <w:sz w:val="15"/>
+                <w:sz w:val="16"/>
               </w:rPr>
               <w:t>Chillán, Región de Ñuble</w:t>
             </w:r>
           </w:p>
           <w:p>
             <w:pPr>
-              <w:spacing w:before="0" w:after="0" w:line="240" w:lineRule="auto"/>
               <w:jc w:val="right"/>
             </w:pPr>
             <w:r>
               <w:rPr>
-                <w:rFonts w:ascii="Arial" w:hAnsi="Arial"/>
                 <w:b w:val="0"/>
                 <w:color w:val="FFFFFF"/>
-                <w:sz w:val="15"/>
+                <w:sz w:val="16"/>
               </w:rPr>
               <w:t>rjoseeliecer@gmail.com</w:t>
             </w:r>
           </w:p>
           <w:p>
             <w:pPr>
-              <w:spacing w:before="0" w:after="0" w:line="240" w:lineRule="auto"/>
               <w:jc w:val="right"/>
             </w:pPr>
             <w:r>
               <w:rPr>
-                <w:rFonts w:ascii="Arial" w:hAnsi="Arial"/>
                 <w:b w:val="0"/>
                 <w:color w:val="FFFFFF"/>
-                <w:sz w:val="15"/>
+                <w:sz w:val="16"/>
               </w:rPr>
               <w:t>github.com/rjoserivera</w:t>
             </w:r>
@@ -129,66 +104,30 @@
         </w:tc>
       </w:tr>
     </w:tbl>
-    <w:tbl>
-      <w:tblPr>
-        <w:tblW w:type="auto" w:w="0"/>
-        <w:jc w:val="center"/>
-        <w:tblLook w:firstColumn="1" w:firstRow="1" w:lastColumn="0" w:lastRow="0" w:noHBand="0" w:noVBand="1" w:val="04A0"/>
-      </w:tblPr>
-      <w:tblGrid>
-        <w:gridCol w:w="11030"/>
-      </w:tblGrid>
-      <w:tr>
-        <w:tc>
-          <w:tcPr>
-            <w:tcW w:type="dxa" w:w="11030"/>
-            <w:shd w:fill="EAF3F7"/>
-            <w:tcMar>
-              <w:top w:w="70" w:type="dxa"/>
-              <w:start w:w="130" w:type="dxa"/>
-              <w:bottom w:w="70" w:type="dxa"/>
-              <w:end w:w="130" w:type="dxa"/>
-            </w:tcMar>
-            <w:tcBorders>
-              <w:top w:val="nil"/>
-              <w:left w:val="nil"/>
-              <w:bottom w:val="nil"/>
-              <w:right w:val="nil"/>
-              <w:insideH w:val="nil"/>
-              <w:insideV w:val="nil"/>
-            </w:tcBorders>
-          </w:tcPr>
-          <w:p>
-            <w:pPr>
-              <w:spacing w:before="0" w:after="20" w:line="240" w:lineRule="auto"/>
-            </w:pPr>
-            <w:r>
-              <w:rPr>
-                <w:rFonts w:ascii="Arial" w:hAnsi="Arial"/>
-                <w:b/>
-                <w:color w:val="1677A3"/>
-                <w:sz w:val="18"/>
-              </w:rPr>
-              <w:t>PERFIL PROFESIONAL</w:t>
-            </w:r>
-          </w:p>
-          <w:p>
-            <w:pPr>
-              <w:spacing w:before="0" w:after="0" w:line="245" w:lineRule="auto"/>
-            </w:pPr>
-            <w:r>
-              <w:rPr>
-                <w:rFonts w:ascii="Arial" w:hAnsi="Arial"/>
-                <w:b w:val="0"/>
-                <w:color w:val="1F2937"/>
-                <w:sz w:val="15"/>
-              </w:rPr>
-              <w:t>Desarrollador Full Stack proactivo, curioso y orientado a soluciones. Experiencia creando productos web completos y contribuyendo en equipos mediante correcciones, nuevas funcionalidades e integración de flujos. Destaco por aprender rápido, adaptarme a tecnologías nuevas, organizar el trabajo y participar activamente desde el análisis hasta la entrega.</w:t>
-            </w:r>
-          </w:p>
-        </w:tc>
-      </w:tr>
-    </w:tbl>
+    <w:p>
+      <w:pPr>
+        <w:spacing w:before="80" w:after="40"/>
+        <w:pBdr>
+          <w:bottom w:val="single" w:sz="8" w:color="1677A8" w:space="3"/>
+        </w:pBdr>
+      </w:pPr>
+      <w:r>
+        <w:rPr>
+          <w:b/>
+          <w:color w:val="17324D"/>
+          <w:sz w:val="18"/>
+        </w:rPr>
+        <w:t>PERFIL PROFESIONAL</w:t>
+      </w:r>
+    </w:p>
+    <w:p>
+      <w:pPr>
+        <w:spacing w:after="40"/>
+      </w:pPr>
+      <w:r>
+        <w:t>Desarrollador Full Stack proactivo y orientado a soluciones, con experiencia creando productos web completos y colaborando en equipos mediante nuevas funcionalidades, correcciones e integración de flujos. Destaco por aprender rápido, adaptarme a nuevas tecnologías y participar activamente desde el análisis hasta la entrega.</w:t>
+      </w:r>
+    </w:p>
     <w:tbl>
       <w:tblPr>
         <w:tblW w:type="auto" w:w="0"/>
@@ -197,259 +136,409 @@
         <w:tblLook w:firstColumn="1" w:firstRow="1" w:lastColumn="0" w:lastRow="0" w:noHBand="0" w:noVBand="1" w:val="04A0"/>
       </w:tblPr>
       <w:tblGrid>
-        <w:gridCol w:w="3283"/>
-        <w:gridCol w:w="7373"/>
+        <w:gridCol w:w="3581"/>
+        <w:gridCol w:w="3581"/>
+        <w:gridCol w:w="3581"/>
       </w:tblGrid>
       <w:tr>
         <w:tc>
           <w:tcPr>
-            <w:tcW w:type="dxa" w:w="5515"/>
-            <w:vAlign w:val="top"/>
-            <w:shd w:fill="F4F7F9"/>
+            <w:tcW w:type="dxa" w:w="3581"/>
+            <w:shd w:fill="EAF2F7"/>
             <w:tcMar>
-              <w:top w:w="65" w:type="dxa"/>
-              <w:start w:w="120" w:type="dxa"/>
-              <w:bottom w:w="50" w:type="dxa"/>
-              <w:end w:w="115" w:type="dxa"/>
+              <w:top w:w="60" w:type="dxa"/>
+              <w:start w:w="90" w:type="dxa"/>
+              <w:bottom w:w="60" w:type="dxa"/>
+              <w:end w:w="90" w:type="dxa"/>
             </w:tcMar>
-            <w:tcBorders>
-              <w:top w:val="nil"/>
-              <w:left w:val="nil"/>
-              <w:bottom w:val="nil"/>
-              <w:right w:val="nil"/>
-              <w:insideH w:val="nil"/>
-              <w:insideV w:val="nil"/>
-            </w:tcBorders>
           </w:tcPr>
-          <w:p/>
+          <w:p>
+            <w:r>
+              <w:rPr>
+                <w:b/>
+                <w:color w:val="1677A8"/>
+                <w:sz w:val="15"/>
+              </w:rPr>
+              <w:t>STACK PRINCIPAL</w:t>
+            </w:r>
+          </w:p>
+          <w:p>
+            <w:r>
+              <w:rPr>
+                <w:b w:val="0"/>
+                <w:color w:val="17324D"/>
+                <w:sz w:val="15"/>
+              </w:rPr>
+              <w:t>React · Next.js · TypeScript · JavaScript · Tailwind</w:t>
+            </w:r>
+          </w:p>
+        </w:tc>
+        <w:tc>
+          <w:tcPr>
+            <w:tcW w:type="dxa" w:w="3581"/>
+            <w:shd w:fill="EAF2F7"/>
+            <w:tcMar>
+              <w:top w:w="60" w:type="dxa"/>
+              <w:start w:w="90" w:type="dxa"/>
+              <w:bottom w:w="60" w:type="dxa"/>
+              <w:end w:w="90" w:type="dxa"/>
+            </w:tcMar>
+          </w:tcPr>
+          <w:p>
+            <w:r>
+              <w:rPr>
+                <w:b/>
+                <w:color w:val="1677A8"/>
+                <w:sz w:val="15"/>
+              </w:rPr>
+              <w:t>BACKEND Y DATOS</w:t>
+            </w:r>
+          </w:p>
+          <w:p>
+            <w:r>
+              <w:rPr>
+                <w:b w:val="0"/>
+                <w:color w:val="17324D"/>
+                <w:sz w:val="15"/>
+              </w:rPr>
+              <w:t>Node.js · PHP · Python · Django · MySQL · PostgreSQL</w:t>
+            </w:r>
+          </w:p>
+        </w:tc>
+        <w:tc>
+          <w:tcPr>
+            <w:tcW w:type="dxa" w:w="3581"/>
+            <w:shd w:fill="EAF2F7"/>
+            <w:tcMar>
+              <w:top w:w="60" w:type="dxa"/>
+              <w:start w:w="90" w:type="dxa"/>
+              <w:bottom w:w="60" w:type="dxa"/>
+              <w:end w:w="90" w:type="dxa"/>
+            </w:tcMar>
+          </w:tcPr>
+          <w:p>
+            <w:r>
+              <w:rPr>
+                <w:b/>
+                <w:color w:val="1677A8"/>
+                <w:sz w:val="15"/>
+              </w:rPr>
+              <w:t>FORTALEZAS</w:t>
+            </w:r>
+          </w:p>
+          <w:p>
+            <w:r>
+              <w:rPr>
+                <w:b w:val="0"/>
+                <w:color w:val="17324D"/>
+                <w:sz w:val="15"/>
+              </w:rPr>
+              <w:t>Trabajo en equipo · Liderazgo · Resolución · Adaptabilidad</w:t>
+            </w:r>
+          </w:p>
+        </w:tc>
+      </w:tr>
+    </w:tbl>
+    <w:p>
+      <w:pPr>
+        <w:spacing w:before="80" w:after="40"/>
+        <w:pBdr>
+          <w:bottom w:val="single" w:sz="8" w:color="1677A8" w:space="3"/>
+        </w:pBdr>
+      </w:pPr>
+      <w:r>
+        <w:rPr>
+          <w:b/>
+          <w:color w:val="17324D"/>
+          <w:sz w:val="18"/>
+        </w:rPr>
+        <w:t>PROYECTOS DESTACADOS</w:t>
+      </w:r>
+    </w:p>
+    <w:p>
+      <w:pPr>
+        <w:spacing w:before="30" w:after="0"/>
+      </w:pPr>
+      <w:r>
+        <w:rPr>
+          <w:b/>
+          <w:color w:val="17324D"/>
+          <w:sz w:val="17"/>
+        </w:rPr>
+        <w:t>Kreative Vit</w:t>
+      </w:r>
+      <w:r>
+        <w:rPr>
+          <w:b/>
+          <w:color w:val="1677A8"/>
+          <w:sz w:val="15"/>
+        </w:rPr>
+        <w:t xml:space="preserve">  |  Desarrollo completo</w:t>
+      </w:r>
+    </w:p>
+    <w:p>
+      <w:pPr>
+        <w:spacing w:after="20"/>
+        <w:ind w:left="173"/>
+      </w:pPr>
+      <w:r>
+        <w:rPr>
+          <w:b w:val="0"/>
+          <w:sz w:val="16"/>
+        </w:rPr>
+        <w:t xml:space="preserve">Plataforma de bienestar con bitácora, seguimiento emocional, paneles y alertas.  </w:t>
+      </w:r>
+      <w:r>
+        <w:rPr>
+          <w:b/>
+          <w:color w:val="1677A8"/>
+          <w:sz w:val="15"/>
+        </w:rPr>
+        <w:t>React · Vite · PHP · MySQL</w:t>
+      </w:r>
+    </w:p>
+    <w:p>
+      <w:pPr>
+        <w:spacing w:before="30" w:after="0"/>
+      </w:pPr>
+      <w:r>
+        <w:rPr>
+          <w:b/>
+          <w:color w:val="17324D"/>
+          <w:sz w:val="17"/>
+        </w:rPr>
+        <w:t>Austral Collector</w:t>
+      </w:r>
+      <w:r>
+        <w:rPr>
+          <w:b/>
+          <w:color w:val="1677A8"/>
+          <w:sz w:val="15"/>
+        </w:rPr>
+        <w:t xml:space="preserve">  |  Desarrollo completo</w:t>
+      </w:r>
+    </w:p>
+    <w:p>
+      <w:pPr>
+        <w:spacing w:after="20"/>
+        <w:ind w:left="173"/>
+      </w:pPr>
+      <w:r>
+        <w:rPr>
+          <w:b w:val="0"/>
+          <w:sz w:val="16"/>
+        </w:rPr>
+        <w:t xml:space="preserve">PWA para una comunidad chilena de coleccionistas de figuras vintage.  </w:t>
+      </w:r>
+      <w:r>
+        <w:rPr>
+          <w:b/>
+          <w:color w:val="1677A8"/>
+          <w:sz w:val="15"/>
+        </w:rPr>
+        <w:t>React · PHP · MySQL · PWA</w:t>
+      </w:r>
+    </w:p>
+    <w:p>
+      <w:pPr>
+        <w:spacing w:before="30" w:after="0"/>
+      </w:pPr>
+      <w:r>
+        <w:rPr>
+          <w:b/>
+          <w:color w:val="17324D"/>
+          <w:sz w:val="17"/>
+        </w:rPr>
+        <w:t>HR Copilot Chile</w:t>
+      </w:r>
+      <w:r>
+        <w:rPr>
+          <w:b/>
+          <w:color w:val="1677A8"/>
+          <w:sz w:val="15"/>
+        </w:rPr>
+        <w:t xml:space="preserve">  |  Desarrollo completo</w:t>
+      </w:r>
+    </w:p>
+    <w:p>
+      <w:pPr>
+        <w:spacing w:after="20"/>
+        <w:ind w:left="173"/>
+      </w:pPr>
+      <w:r>
+        <w:rPr>
+          <w:b w:val="0"/>
+          <w:sz w:val="16"/>
+        </w:rPr>
+        <w:t xml:space="preserve">Asistente inteligente para consultas sobre el contexto laboral chileno.  </w:t>
+      </w:r>
+      <w:r>
+        <w:rPr>
+          <w:b/>
+          <w:color w:val="1677A8"/>
+          <w:sz w:val="15"/>
+        </w:rPr>
+        <w:t>Next.js · TypeScript · IA</w:t>
+      </w:r>
+    </w:p>
+    <w:p>
+      <w:pPr>
+        <w:spacing w:before="30" w:after="0"/>
+      </w:pPr>
+      <w:r>
+        <w:rPr>
+          <w:b/>
+          <w:color w:val="17324D"/>
+          <w:sz w:val="17"/>
+        </w:rPr>
+        <w:t>Kreative · Perfiles Web</w:t>
+      </w:r>
+      <w:r>
+        <w:rPr>
+          <w:b/>
+          <w:color w:val="1677A8"/>
+          <w:sz w:val="15"/>
+        </w:rPr>
+        <w:t xml:space="preserve">  |  Contribución técnica</w:t>
+      </w:r>
+    </w:p>
+    <w:p>
+      <w:pPr>
+        <w:spacing w:after="20"/>
+        <w:ind w:left="173"/>
+      </w:pPr>
+      <w:r>
+        <w:rPr>
+          <w:b w:val="0"/>
+          <w:sz w:val="16"/>
+        </w:rPr>
+        <w:t xml:space="preserve">Correcciones de frontend y mejoras en perfiles y onboarding.  </w:t>
+      </w:r>
+      <w:r>
+        <w:rPr>
+          <w:b/>
+          <w:color w:val="1677A8"/>
+          <w:sz w:val="15"/>
+        </w:rPr>
+        <w:t>JavaScript · PHP · MySQL · Bootstrap</w:t>
+      </w:r>
+    </w:p>
+    <w:p>
+      <w:pPr>
+        <w:spacing w:before="30" w:after="0"/>
+      </w:pPr>
+      <w:r>
+        <w:rPr>
+          <w:b/>
+          <w:color w:val="17324D"/>
+          <w:sz w:val="17"/>
+        </w:rPr>
+        <w:t>Wiki Kreative</w:t>
+      </w:r>
+      <w:r>
+        <w:rPr>
+          <w:b/>
+          <w:color w:val="1677A8"/>
+          <w:sz w:val="15"/>
+        </w:rPr>
+        <w:t xml:space="preserve">  |  Contribución técnica</w:t>
+      </w:r>
+    </w:p>
+    <w:p>
+      <w:pPr>
+        <w:spacing w:after="20"/>
+        <w:ind w:left="173"/>
+      </w:pPr>
+      <w:r>
+        <w:rPr>
+          <w:b w:val="0"/>
+          <w:sz w:val="16"/>
+        </w:rPr>
+        <w:t xml:space="preserve">Mejoras en publicaciones, filtros, rutas, roles y autenticación.  </w:t>
+      </w:r>
+      <w:r>
+        <w:rPr>
+          <w:b/>
+          <w:color w:val="1677A8"/>
+          <w:sz w:val="15"/>
+        </w:rPr>
+        <w:t>PHP MVC · JavaScript · MySQL · JWT</w:t>
+      </w:r>
+    </w:p>
+    <w:p>
+      <w:pPr>
+        <w:spacing w:before="30" w:after="0"/>
+      </w:pPr>
+      <w:r>
+        <w:rPr>
+          <w:b/>
+          <w:color w:val="17324D"/>
+          <w:sz w:val="17"/>
+        </w:rPr>
+        <w:t>Sistema Auth Alpha Docere</w:t>
+      </w:r>
+      <w:r>
+        <w:rPr>
+          <w:b/>
+          <w:color w:val="1677A8"/>
+          <w:sz w:val="15"/>
+        </w:rPr>
+        <w:t xml:space="preserve">  |  Contribución técnica</w:t>
+      </w:r>
+    </w:p>
+    <w:p>
+      <w:pPr>
+        <w:spacing w:after="20"/>
+        <w:ind w:left="173"/>
+      </w:pPr>
+      <w:r>
+        <w:rPr>
+          <w:b w:val="0"/>
+          <w:sz w:val="16"/>
+        </w:rPr>
+        <w:t xml:space="preserve">Integración y correcciones en registro, acceso y verificación por correo.  </w:t>
+      </w:r>
+      <w:r>
+        <w:rPr>
+          <w:b/>
+          <w:color w:val="1677A8"/>
+          <w:sz w:val="15"/>
+        </w:rPr>
+        <w:t>JWT · PHP · Email · MySQL</w:t>
+      </w:r>
+    </w:p>
+    <w:tbl>
+      <w:tblPr>
+        <w:tblW w:type="auto" w:w="0"/>
+        <w:jc w:val="center"/>
+        <w:tblLayout w:type="fixed"/>
+        <w:tblLook w:firstColumn="1" w:firstRow="1" w:lastColumn="0" w:lastRow="0" w:noHBand="0" w:noVBand="1" w:val="04A0"/>
+      </w:tblPr>
+      <w:tblGrid>
+        <w:gridCol w:w="5472"/>
+        <w:gridCol w:w="4968"/>
+      </w:tblGrid>
+      <w:tr>
+        <w:tc>
+          <w:tcPr>
+            <w:tcW w:type="dxa" w:w="5371"/>
+            <w:tcMar>
+              <w:top w:w="20" w:type="dxa"/>
+              <w:start w:w="0" w:type="dxa"/>
+              <w:bottom w:w="0" w:type="dxa"/>
+              <w:end w:w="120" w:type="dxa"/>
+            </w:tcMar>
+          </w:tcPr>
           <w:p>
             <w:pPr>
-              <w:keepNext/>
-              <w:spacing w:before="80" w:after="40" w:line="240" w:lineRule="auto"/>
+              <w:pBdr>
+                <w:bottom w:val="single" w:sz="8" w:color="1677A8" w:space="3"/>
+              </w:pBdr>
             </w:pPr>
             <w:r>
               <w:rPr>
-                <w:rFonts w:ascii="Arial" w:hAnsi="Arial"/>
                 <w:b/>
-                <w:color w:val="1677A3"/>
-                <w:sz w:val="18"/>
-              </w:rPr>
-              <w:t>COMPETENCIAS</w:t>
-            </w:r>
-          </w:p>
-          <w:p>
-            <w:pPr>
-              <w:pStyle w:val="ListBullet"/>
-              <w:spacing w:before="0" w:after="12" w:line="240" w:lineRule="auto"/>
-              <w:ind w:left="202" w:hanging="144"/>
-            </w:pPr>
-            <w:r>
-              <w:rPr>
-                <w:rFonts w:ascii="Arial" w:hAnsi="Arial"/>
-                <w:b w:val="0"/>
-                <w:color w:val="1F2937"/>
-                <w:sz w:val="15"/>
-              </w:rPr>
-              <w:t>Trabajo en equipo</w:t>
-            </w:r>
-          </w:p>
-          <w:p>
-            <w:pPr>
-              <w:pStyle w:val="ListBullet"/>
-              <w:spacing w:before="0" w:after="12" w:line="240" w:lineRule="auto"/>
-              <w:ind w:left="202" w:hanging="144"/>
-            </w:pPr>
-            <w:r>
-              <w:rPr>
-                <w:rFonts w:ascii="Arial" w:hAnsi="Arial"/>
-                <w:b w:val="0"/>
-                <w:color w:val="1F2937"/>
-                <w:sz w:val="15"/>
-              </w:rPr>
-              <w:t>Liderazgo y organización</w:t>
-            </w:r>
-          </w:p>
-          <w:p>
-            <w:pPr>
-              <w:pStyle w:val="ListBullet"/>
-              <w:spacing w:before="0" w:after="12" w:line="240" w:lineRule="auto"/>
-              <w:ind w:left="202" w:hanging="144"/>
-            </w:pPr>
-            <w:r>
-              <w:rPr>
-                <w:rFonts w:ascii="Arial" w:hAnsi="Arial"/>
-                <w:b w:val="0"/>
-                <w:color w:val="1F2937"/>
-                <w:sz w:val="15"/>
-              </w:rPr>
-              <w:t>Resolución de problemas</w:t>
-            </w:r>
-          </w:p>
-          <w:p>
-            <w:pPr>
-              <w:pStyle w:val="ListBullet"/>
-              <w:spacing w:before="0" w:after="12" w:line="240" w:lineRule="auto"/>
-              <w:ind w:left="202" w:hanging="144"/>
-            </w:pPr>
-            <w:r>
-              <w:rPr>
-                <w:rFonts w:ascii="Arial" w:hAnsi="Arial"/>
-                <w:b w:val="0"/>
-                <w:color w:val="1F2937"/>
-                <w:sz w:val="15"/>
-              </w:rPr>
-              <w:t>Aprendizaje rápido</w:t>
-            </w:r>
-          </w:p>
-          <w:p>
-            <w:pPr>
-              <w:pStyle w:val="ListBullet"/>
-              <w:spacing w:before="0" w:after="12" w:line="240" w:lineRule="auto"/>
-              <w:ind w:left="202" w:hanging="144"/>
-            </w:pPr>
-            <w:r>
-              <w:rPr>
-                <w:rFonts w:ascii="Arial" w:hAnsi="Arial"/>
-                <w:b w:val="0"/>
-                <w:color w:val="1F2937"/>
-                <w:sz w:val="15"/>
-              </w:rPr>
-              <w:t>Comunicación efectiva</w:t>
-            </w:r>
-          </w:p>
-          <w:p>
-            <w:pPr>
-              <w:pStyle w:val="ListBullet"/>
-              <w:spacing w:before="0" w:after="12" w:line="240" w:lineRule="auto"/>
-              <w:ind w:left="202" w:hanging="144"/>
-            </w:pPr>
-            <w:r>
-              <w:rPr>
-                <w:rFonts w:ascii="Arial" w:hAnsi="Arial"/>
-                <w:b w:val="0"/>
-                <w:color w:val="1F2937"/>
-                <w:sz w:val="15"/>
-              </w:rPr>
-              <w:t>Adaptabilidad</w:t>
-            </w:r>
-          </w:p>
-          <w:p>
-            <w:pPr>
-              <w:keepNext/>
-              <w:spacing w:before="100" w:after="40" w:line="240" w:lineRule="auto"/>
-            </w:pPr>
-            <w:r>
-              <w:rPr>
-                <w:rFonts w:ascii="Arial" w:hAnsi="Arial"/>
-                <w:b/>
-                <w:color w:val="1677A3"/>
-                <w:sz w:val="18"/>
-              </w:rPr>
-              <w:t>STACK TÉCNICO</w:t>
-            </w:r>
-          </w:p>
-          <w:p>
-            <w:pPr>
-              <w:spacing w:before="0" w:after="24" w:line="240" w:lineRule="auto"/>
-            </w:pPr>
-            <w:r>
-              <w:rPr>
-                <w:rFonts w:ascii="Arial" w:hAnsi="Arial"/>
-                <w:b/>
-                <w:color w:val="1F2937"/>
-                <w:sz w:val="15"/>
-              </w:rPr>
-              <w:t xml:space="preserve">Frontend: </w:t>
-            </w:r>
-            <w:r>
-              <w:rPr>
-                <w:rFonts w:ascii="Arial" w:hAnsi="Arial"/>
-                <w:b w:val="0"/>
-                <w:color w:val="4B5563"/>
-                <w:sz w:val="14"/>
-              </w:rPr>
-              <w:t>React, Next.js, TypeScript, JavaScript, HTML5, CSS3, Tailwind</w:t>
-            </w:r>
-          </w:p>
-          <w:p>
-            <w:pPr>
-              <w:spacing w:before="0" w:after="24" w:line="240" w:lineRule="auto"/>
-            </w:pPr>
-            <w:r>
-              <w:rPr>
-                <w:rFonts w:ascii="Arial" w:hAnsi="Arial"/>
-                <w:b/>
-                <w:color w:val="1F2937"/>
-                <w:sz w:val="15"/>
-              </w:rPr>
-              <w:t xml:space="preserve">Backend: </w:t>
-            </w:r>
-            <w:r>
-              <w:rPr>
-                <w:rFonts w:ascii="Arial" w:hAnsi="Arial"/>
-                <w:b w:val="0"/>
-                <w:color w:val="4B5563"/>
-                <w:sz w:val="14"/>
-              </w:rPr>
-              <w:t>Node.js, PHP, Python, Django, REST API, JWT</w:t>
-            </w:r>
-          </w:p>
-          <w:p>
-            <w:pPr>
-              <w:spacing w:before="0" w:after="24" w:line="240" w:lineRule="auto"/>
-            </w:pPr>
-            <w:r>
-              <w:rPr>
-                <w:rFonts w:ascii="Arial" w:hAnsi="Arial"/>
-                <w:b/>
-                <w:color w:val="1F2937"/>
-                <w:sz w:val="15"/>
-              </w:rPr>
-              <w:t xml:space="preserve">Datos: </w:t>
-            </w:r>
-            <w:r>
-              <w:rPr>
-                <w:rFonts w:ascii="Arial" w:hAnsi="Arial"/>
-                <w:b w:val="0"/>
-                <w:color w:val="4B5563"/>
-                <w:sz w:val="14"/>
-              </w:rPr>
-              <w:t>MySQL, PostgreSQL</w:t>
-            </w:r>
-          </w:p>
-          <w:p>
-            <w:pPr>
-              <w:spacing w:before="0" w:after="24" w:line="240" w:lineRule="auto"/>
-            </w:pPr>
-            <w:r>
-              <w:rPr>
-                <w:rFonts w:ascii="Arial" w:hAnsi="Arial"/>
-                <w:b/>
-                <w:color w:val="1F2937"/>
-                <w:sz w:val="15"/>
-              </w:rPr>
-              <w:t xml:space="preserve">Herramientas: </w:t>
-            </w:r>
-            <w:r>
-              <w:rPr>
-                <w:rFonts w:ascii="Arial" w:hAnsi="Arial"/>
-                <w:b w:val="0"/>
-                <w:color w:val="4B5563"/>
-                <w:sz w:val="14"/>
-              </w:rPr>
-              <w:t>Git, GitHub, Vercel, PWA, IA aplicada</w:t>
-            </w:r>
-          </w:p>
-          <w:p>
-            <w:pPr>
-              <w:keepNext/>
-              <w:spacing w:before="100" w:after="40" w:line="240" w:lineRule="auto"/>
-            </w:pPr>
-            <w:r>
-              <w:rPr>
-                <w:rFonts w:ascii="Arial" w:hAnsi="Arial"/>
-                <w:b/>
-                <w:color w:val="1677A3"/>
+                <w:color w:val="17324D"/>
                 <w:sz w:val="18"/>
               </w:rPr>
               <w:t>FORMACIÓN</w:t>
@@ -457,491 +546,124 @@
           </w:p>
           <w:p>
             <w:pPr>
-              <w:spacing w:before="0" w:after="26" w:line="240" w:lineRule="auto"/>
+              <w:spacing w:after="20"/>
             </w:pPr>
             <w:r>
               <w:rPr>
-                <w:rFonts w:ascii="Arial" w:hAnsi="Arial"/>
                 <w:b/>
-                <w:color w:val="1F2937"/>
-                <w:sz w:val="15"/>
+                <w:color w:val="17324D"/>
+                <w:sz w:val="16"/>
               </w:rPr>
               <w:t>Ingeniería en Informática</w:t>
             </w:r>
             <w:r>
               <w:rPr>
-                <w:rFonts w:ascii="Arial" w:hAnsi="Arial"/>
                 <w:b w:val="0"/>
-                <w:color w:val="4B5563"/>
-                <w:sz w:val="14"/>
+                <w:sz w:val="16"/>
               </w:rPr>
-              <w:br/>
-              <w:t>En curso</w:t>
+              <w:t xml:space="preserve"> — En curso</w:t>
             </w:r>
           </w:p>
           <w:p>
             <w:pPr>
-              <w:spacing w:before="0" w:after="26" w:line="240" w:lineRule="auto"/>
+              <w:spacing w:after="20"/>
             </w:pPr>
             <w:r>
               <w:rPr>
-                <w:rFonts w:ascii="Arial" w:hAnsi="Arial"/>
                 <w:b/>
-                <w:color w:val="1F2937"/>
-                <w:sz w:val="15"/>
+                <w:color w:val="17324D"/>
+                <w:sz w:val="16"/>
               </w:rPr>
               <w:t>TNS Analista Programador</w:t>
             </w:r>
             <w:r>
               <w:rPr>
-                <w:rFonts w:ascii="Arial" w:hAnsi="Arial"/>
                 <w:b w:val="0"/>
-                <w:color w:val="4B5563"/>
-                <w:sz w:val="14"/>
+                <w:sz w:val="16"/>
               </w:rPr>
-              <w:br/>
-              <w:t>Titulado · 2026</w:t>
+              <w:t xml:space="preserve"> — Titulado · 2026</w:t>
             </w:r>
           </w:p>
           <w:p>
             <w:pPr>
-              <w:spacing w:before="0" w:after="26" w:line="240" w:lineRule="auto"/>
+              <w:spacing w:after="20"/>
             </w:pPr>
             <w:r>
               <w:rPr>
-                <w:rFonts w:ascii="Arial" w:hAnsi="Arial"/>
                 <w:b/>
-                <w:color w:val="1F2937"/>
-                <w:sz w:val="15"/>
+                <w:color w:val="17324D"/>
+                <w:sz w:val="16"/>
               </w:rPr>
-              <w:t>Técnico de Nivel Medio en Electrónica</w:t>
+              <w:t>Técnico Nivel Medio en Electrónica</w:t>
             </w:r>
             <w:r>
               <w:rPr>
-                <w:rFonts w:ascii="Arial" w:hAnsi="Arial"/>
                 <w:b w:val="0"/>
-                <w:color w:val="4B5563"/>
-                <w:sz w:val="14"/>
+                <w:sz w:val="16"/>
               </w:rPr>
-              <w:br/>
-              <w:t>2013–2015 · Titulado 2015</w:t>
-            </w:r>
-          </w:p>
-          <w:p>
-            <w:pPr>
-              <w:keepNext/>
-              <w:spacing w:before="100" w:after="40" w:line="240" w:lineRule="auto"/>
-            </w:pPr>
-            <w:r>
-              <w:rPr>
-                <w:rFonts w:ascii="Arial" w:hAnsi="Arial"/>
-                <w:b/>
-                <w:color w:val="1677A3"/>
-                <w:sz w:val="18"/>
-              </w:rPr>
-              <w:t>IDIOMAS</w:t>
-            </w:r>
-          </w:p>
-          <w:p>
-            <w:pPr>
-              <w:pStyle w:val="ListBullet"/>
-              <w:spacing w:before="0" w:after="12" w:line="240" w:lineRule="auto"/>
-              <w:ind w:left="202" w:hanging="144"/>
-            </w:pPr>
-            <w:r>
-              <w:rPr>
-                <w:rFonts w:ascii="Arial" w:hAnsi="Arial"/>
-                <w:b w:val="0"/>
-                <w:color w:val="1F2937"/>
-                <w:sz w:val="15"/>
-              </w:rPr>
-              <w:t>Español · Nativo</w:t>
-            </w:r>
-          </w:p>
-          <w:p>
-            <w:pPr>
-              <w:pStyle w:val="ListBullet"/>
-              <w:spacing w:before="0" w:after="12" w:line="240" w:lineRule="auto"/>
-              <w:ind w:left="202" w:hanging="144"/>
-            </w:pPr>
-            <w:r>
-              <w:rPr>
-                <w:rFonts w:ascii="Arial" w:hAnsi="Arial"/>
-                <w:b w:val="0"/>
-                <w:color w:val="1F2937"/>
-                <w:sz w:val="15"/>
-              </w:rPr>
-              <w:t>Inglés · Básico y lectura técnica</w:t>
-            </w:r>
-          </w:p>
-          <w:p>
-            <w:pPr>
-              <w:keepNext/>
-              <w:spacing w:before="100" w:after="40" w:line="240" w:lineRule="auto"/>
-            </w:pPr>
-            <w:r>
-              <w:rPr>
-                <w:rFonts w:ascii="Arial" w:hAnsi="Arial"/>
-                <w:b/>
-                <w:color w:val="1677A3"/>
-                <w:sz w:val="18"/>
-              </w:rPr>
-              <w:t>PORTAFOLIO</w:t>
-            </w:r>
-          </w:p>
-          <w:p>
-            <w:pPr>
-              <w:spacing w:before="0" w:after="0" w:line="240" w:lineRule="auto"/>
-            </w:pPr>
-            <w:r>
-              <w:rPr>
-                <w:rFonts w:ascii="Arial" w:hAnsi="Arial"/>
-                <w:b/>
-                <w:color w:val="1677A3"/>
-                <w:sz w:val="14"/>
-              </w:rPr>
-              <w:t>portfolio-page-for-ui-developer-two-beige.vercel.app</w:t>
+              <w:t xml:space="preserve"> — 2013–2015 · Titulado 2015</w:t>
             </w:r>
           </w:p>
         </w:tc>
         <w:tc>
           <w:tcPr>
-            <w:tcW w:type="dxa" w:w="5515"/>
-            <w:vAlign w:val="top"/>
+            <w:tcW w:type="dxa" w:w="5371"/>
             <w:tcMar>
-              <w:top w:w="65" w:type="dxa"/>
-              <w:start w:w="130" w:type="dxa"/>
-              <w:bottom w:w="50" w:type="dxa"/>
-              <w:end w:w="80" w:type="dxa"/>
+              <w:top w:w="20" w:type="dxa"/>
+              <w:start w:w="0" w:type="dxa"/>
+              <w:bottom w:w="0" w:type="dxa"/>
+              <w:end w:w="120" w:type="dxa"/>
             </w:tcMar>
-            <w:tcBorders>
-              <w:top w:val="nil"/>
-              <w:left w:val="nil"/>
-              <w:bottom w:val="nil"/>
-              <w:right w:val="nil"/>
-              <w:insideH w:val="nil"/>
-              <w:insideV w:val="nil"/>
-            </w:tcBorders>
           </w:tcPr>
-          <w:p/>
           <w:p>
             <w:pPr>
-              <w:keepNext/>
-              <w:spacing w:before="0" w:after="40" w:line="240" w:lineRule="auto"/>
+              <w:pBdr>
+                <w:bottom w:val="single" w:sz="8" w:color="1677A8" w:space="3"/>
+              </w:pBdr>
             </w:pPr>
             <w:r>
               <w:rPr>
-                <w:rFonts w:ascii="Arial" w:hAnsi="Arial"/>
                 <w:b/>
-                <w:color w:val="1677A3"/>
+                <w:color w:val="17324D"/>
                 <w:sz w:val="18"/>
               </w:rPr>
-              <w:t>PROYECTOS DESTACADOS</w:t>
+              <w:t>IDIOMAS Y ENLACES</w:t>
             </w:r>
           </w:p>
           <w:p>
             <w:pPr>
-              <w:spacing w:before="32" w:after="4" w:line="240" w:lineRule="auto"/>
+              <w:spacing w:after="20"/>
             </w:pPr>
             <w:r>
               <w:rPr>
-                <w:rFonts w:ascii="Arial" w:hAnsi="Arial"/>
-                <w:b/>
-                <w:color w:val="1F2937"/>
+                <w:b w:val="0"/>
                 <w:sz w:val="16"/>
               </w:rPr>
-              <w:t>Kreative Vit</w:t>
-            </w:r>
-            <w:r>
-              <w:rPr>
-                <w:rFonts w:ascii="Arial" w:hAnsi="Arial"/>
-                <w:b/>
-                <w:color w:val="1677A3"/>
-                <w:sz w:val="14"/>
-              </w:rPr>
-              <w:t xml:space="preserve">  ·  Desarrollo completo</w:t>
+              <w:t>Español · Nativo  |  Inglés · Básico y lectura técnica</w:t>
             </w:r>
           </w:p>
           <w:p>
             <w:pPr>
-              <w:spacing w:before="0" w:after="10" w:line="240" w:lineRule="auto"/>
+              <w:spacing w:after="20"/>
             </w:pPr>
             <w:r>
               <w:rPr>
-                <w:rFonts w:ascii="Arial" w:hAnsi="Arial"/>
                 <w:b w:val="0"/>
-                <w:color w:val="4B5563"/>
-                <w:sz w:val="14"/>
+                <w:sz w:val="16"/>
               </w:rPr>
-              <w:t>Plataforma de bienestar y productividad con bitácora, seguimiento emocional, paneles y alertas.</w:t>
-            </w:r>
-            <w:r>
-              <w:rPr>
-                <w:rFonts w:ascii="Arial" w:hAnsi="Arial"/>
-                <w:b/>
-                <w:color w:val="1F2937"/>
-                <w:sz w:val="14"/>
-              </w:rPr>
-              <w:t xml:space="preserve">  |  React · Vite · PHP · MySQL</w:t>
+              <w:t>Portafolio: portfolio-page-for-ui-developer-two-beige.vercel.app</w:t>
             </w:r>
           </w:p>
           <w:p>
             <w:pPr>
-              <w:spacing w:before="32" w:after="4" w:line="240" w:lineRule="auto"/>
+              <w:spacing w:after="20"/>
             </w:pPr>
             <w:r>
               <w:rPr>
-                <w:rFonts w:ascii="Arial" w:hAnsi="Arial"/>
-                <w:b/>
-                <w:color w:val="1F2937"/>
+                <w:b w:val="0"/>
                 <w:sz w:val="16"/>
               </w:rPr>
-              <w:t>Austral Collector</w:t>
-            </w:r>
-            <w:r>
-              <w:rPr>
-                <w:rFonts w:ascii="Arial" w:hAnsi="Arial"/>
-                <w:b/>
-                <w:color w:val="1677A3"/>
-                <w:sz w:val="14"/>
-              </w:rPr>
-              <w:t xml:space="preserve">  ·  Desarrollo completo</w:t>
-            </w:r>
-          </w:p>
-          <w:p>
-            <w:pPr>
-              <w:spacing w:before="0" w:after="10" w:line="240" w:lineRule="auto"/>
-            </w:pPr>
-            <w:r>
-              <w:rPr>
-                <w:rFonts w:ascii="Arial" w:hAnsi="Arial"/>
-                <w:b w:val="0"/>
-                <w:color w:val="4B5563"/>
-                <w:sz w:val="14"/>
-              </w:rPr>
-              <w:t>Plataforma PWA para una comunidad chilena de coleccionistas de figuras vintage y juguetes retro.</w:t>
-            </w:r>
-            <w:r>
-              <w:rPr>
-                <w:rFonts w:ascii="Arial" w:hAnsi="Arial"/>
-                <w:b/>
-                <w:color w:val="1F2937"/>
-                <w:sz w:val="14"/>
-              </w:rPr>
-              <w:t xml:space="preserve">  |  React · PHP · MySQL · PWA</w:t>
-            </w:r>
-          </w:p>
-          <w:p>
-            <w:pPr>
-              <w:spacing w:before="32" w:after="4" w:line="240" w:lineRule="auto"/>
-            </w:pPr>
-            <w:r>
-              <w:rPr>
-                <w:rFonts w:ascii="Arial" w:hAnsi="Arial"/>
-                <w:b/>
-                <w:color w:val="1F2937"/>
-                <w:sz w:val="16"/>
-              </w:rPr>
-              <w:t>HR Copilot Chile</w:t>
-            </w:r>
-            <w:r>
-              <w:rPr>
-                <w:rFonts w:ascii="Arial" w:hAnsi="Arial"/>
-                <w:b/>
-                <w:color w:val="1677A3"/>
-                <w:sz w:val="14"/>
-              </w:rPr>
-              <w:t xml:space="preserve">  ·  Desarrollo completo</w:t>
-            </w:r>
-          </w:p>
-          <w:p>
-            <w:pPr>
-              <w:spacing w:before="0" w:after="10" w:line="240" w:lineRule="auto"/>
-            </w:pPr>
-            <w:r>
-              <w:rPr>
-                <w:rFonts w:ascii="Arial" w:hAnsi="Arial"/>
-                <w:b w:val="0"/>
-                <w:color w:val="4B5563"/>
-                <w:sz w:val="14"/>
-              </w:rPr>
-              <w:t>Asistente inteligente para consultas sobre el contexto laboral chileno.</w:t>
-            </w:r>
-            <w:r>
-              <w:rPr>
-                <w:rFonts w:ascii="Arial" w:hAnsi="Arial"/>
-                <w:b/>
-                <w:color w:val="1F2937"/>
-                <w:sz w:val="14"/>
-              </w:rPr>
-              <w:t xml:space="preserve">  |  Next.js · TypeScript · IA</w:t>
-            </w:r>
-          </w:p>
-          <w:p>
-            <w:pPr>
-              <w:spacing w:before="32" w:after="4" w:line="240" w:lineRule="auto"/>
-            </w:pPr>
-            <w:r>
-              <w:rPr>
-                <w:rFonts w:ascii="Arial" w:hAnsi="Arial"/>
-                <w:b/>
-                <w:color w:val="1F2937"/>
-                <w:sz w:val="16"/>
-              </w:rPr>
-              <w:t>Kreative · Perfiles Web</w:t>
-            </w:r>
-            <w:r>
-              <w:rPr>
-                <w:rFonts w:ascii="Arial" w:hAnsi="Arial"/>
-                <w:b/>
-                <w:color w:val="1677A3"/>
-                <w:sz w:val="14"/>
-              </w:rPr>
-              <w:t xml:space="preserve">  ·  Contribución técnica</w:t>
-            </w:r>
-          </w:p>
-          <w:p>
-            <w:pPr>
-              <w:spacing w:before="0" w:after="10" w:line="240" w:lineRule="auto"/>
-            </w:pPr>
-            <w:r>
-              <w:rPr>
-                <w:rFonts w:ascii="Arial" w:hAnsi="Arial"/>
-                <w:b w:val="0"/>
-                <w:color w:val="4B5563"/>
-                <w:sz w:val="14"/>
-              </w:rPr>
-              <w:t>Correcciones de frontend y mejoras en los flujos de perfiles y onboarding.</w:t>
-            </w:r>
-            <w:r>
-              <w:rPr>
-                <w:rFonts w:ascii="Arial" w:hAnsi="Arial"/>
-                <w:b/>
-                <w:color w:val="1F2937"/>
-                <w:sz w:val="14"/>
-              </w:rPr>
-              <w:t xml:space="preserve">  |  JavaScript · PHP · MySQL · Bootstrap</w:t>
-            </w:r>
-          </w:p>
-          <w:p>
-            <w:pPr>
-              <w:spacing w:before="32" w:after="4" w:line="240" w:lineRule="auto"/>
-            </w:pPr>
-            <w:r>
-              <w:rPr>
-                <w:rFonts w:ascii="Arial" w:hAnsi="Arial"/>
-                <w:b/>
-                <w:color w:val="1F2937"/>
-                <w:sz w:val="16"/>
-              </w:rPr>
-              <w:t>Wiki Kreative</w:t>
-            </w:r>
-            <w:r>
-              <w:rPr>
-                <w:rFonts w:ascii="Arial" w:hAnsi="Arial"/>
-                <w:b/>
-                <w:color w:val="1677A3"/>
-                <w:sz w:val="14"/>
-              </w:rPr>
-              <w:t xml:space="preserve">  ·  Contribución técnica</w:t>
-            </w:r>
-          </w:p>
-          <w:p>
-            <w:pPr>
-              <w:spacing w:before="0" w:after="10" w:line="240" w:lineRule="auto"/>
-            </w:pPr>
-            <w:r>
-              <w:rPr>
-                <w:rFonts w:ascii="Arial" w:hAnsi="Arial"/>
-                <w:b w:val="0"/>
-                <w:color w:val="4B5563"/>
-                <w:sz w:val="14"/>
-              </w:rPr>
-              <w:t>Mejoras en publicaciones, filtros, rutas, roles y autenticación.</w:t>
-            </w:r>
-            <w:r>
-              <w:rPr>
-                <w:rFonts w:ascii="Arial" w:hAnsi="Arial"/>
-                <w:b/>
-                <w:color w:val="1F2937"/>
-                <w:sz w:val="14"/>
-              </w:rPr>
-              <w:t xml:space="preserve">  |  PHP MVC · JavaScript · MySQL · JWT</w:t>
-            </w:r>
-          </w:p>
-          <w:p>
-            <w:pPr>
-              <w:spacing w:before="32" w:after="4" w:line="240" w:lineRule="auto"/>
-            </w:pPr>
-            <w:r>
-              <w:rPr>
-                <w:rFonts w:ascii="Arial" w:hAnsi="Arial"/>
-                <w:b/>
-                <w:color w:val="1F2937"/>
-                <w:sz w:val="16"/>
-              </w:rPr>
-              <w:t>Sistema Auth Alpha Docere</w:t>
-            </w:r>
-            <w:r>
-              <w:rPr>
-                <w:rFonts w:ascii="Arial" w:hAnsi="Arial"/>
-                <w:b/>
-                <w:color w:val="1677A3"/>
-                <w:sz w:val="14"/>
-              </w:rPr>
-              <w:t xml:space="preserve">  ·  Contribución técnica</w:t>
-            </w:r>
-          </w:p>
-          <w:p>
-            <w:pPr>
-              <w:spacing w:before="0" w:after="10" w:line="240" w:lineRule="auto"/>
-            </w:pPr>
-            <w:r>
-              <w:rPr>
-                <w:rFonts w:ascii="Arial" w:hAnsi="Arial"/>
-                <w:b w:val="0"/>
-                <w:color w:val="4B5563"/>
-                <w:sz w:val="14"/>
-              </w:rPr>
-              <w:t>Correcciones e integración de registro, acceso, rutas protegidas y verificación por correo.</w:t>
-            </w:r>
-            <w:r>
-              <w:rPr>
-                <w:rFonts w:ascii="Arial" w:hAnsi="Arial"/>
-                <w:b/>
-                <w:color w:val="1F2937"/>
-                <w:sz w:val="14"/>
-              </w:rPr>
-              <w:t xml:space="preserve">  |  JWT · PHP · Email · MySQL</w:t>
-            </w:r>
-          </w:p>
-          <w:p>
-            <w:pPr>
-              <w:keepNext/>
-              <w:spacing w:before="100" w:after="40" w:line="240" w:lineRule="auto"/>
-            </w:pPr>
-            <w:r>
-              <w:rPr>
-                <w:rFonts w:ascii="Arial" w:hAnsi="Arial"/>
-                <w:b/>
-                <w:color w:val="1677A3"/>
-                <w:sz w:val="18"/>
-              </w:rPr>
-              <w:t>ENFOQUE PROFESIONAL</w:t>
-            </w:r>
-          </w:p>
-          <w:p>
-            <w:pPr>
-              <w:spacing w:before="0" w:after="0" w:line="240" w:lineRule="auto"/>
-            </w:pPr>
-            <w:r>
-              <w:rPr>
-                <w:rFonts w:ascii="Arial" w:hAnsi="Arial"/>
-                <w:b w:val="0"/>
-                <w:color w:val="4B5563"/>
-                <w:sz w:val="15"/>
-              </w:rPr>
-              <w:t>Busco integrarme a un equipo donde pueda aportar en desarrollo web, resolución técnica y construcción de productos útiles, mientras continúo creciendo profesionalmente.</w:t>
+              <w:t>GitHub: github.com/rjoserivera</w:t>
             </w:r>
           </w:p>
         </w:tc>
@@ -950,7 +672,7 @@
     <w:sectPr>
       <w:footerReference w:type="default" r:id="rId9"/>
       <w:pgSz w:w="12240" w:h="15840"/>
-      <w:pgMar w:top="461" w:right="605" w:bottom="461" w:left="605" w:header="144" w:footer="144" w:gutter="0"/>
+      <w:pgMar w:top="547" w:right="749" w:bottom="504" w:left="749" w:header="720" w:footer="720" w:gutter="0"/>
       <w:cols w:space="720"/>
       <w:docGrid w:linePitch="360"/>
     </w:sectPr>
@@ -963,17 +685,15 @@
   <w:p>
     <w:pPr>
       <w:pStyle w:val="Footer"/>
-      <w:spacing w:before="0" w:after="0" w:line="240" w:lineRule="auto"/>
       <w:jc w:val="center"/>
     </w:pPr>
     <w:r>
       <w:rPr>
-        <w:rFonts w:ascii="Arial" w:hAnsi="Arial"/>
-        <w:b w:val="0"/>
-        <w:color w:val="4B5563"/>
+        <w:b/>
+        <w:color w:val="1677A8"/>
         <w:sz w:val="14"/>
       </w:rPr>
-      <w:t>José Eliecer Rivera  ·  CV 2026</w:t>
+      <w:t>JOSÉ ELIECER RIVERA  ·  DESARROLLADOR FULL STACK</w:t>
     </w:r>
   </w:p>
 </w:ftr>
@@ -1343,10 +1063,11 @@
     <w:qFormat/>
     <w:rsid w:val="00FC693F"/>
     <w:pPr>
-      <w:spacing w:after="0"/>
+      <w:spacing w:after="30" w:line="240" w:lineRule="auto"/>
     </w:pPr>
     <w:rPr>
-      <w:rFonts w:ascii="Arial" w:hAnsi="Arial"/>
+      <w:rFonts w:ascii="Aptos" w:hAnsi="Aptos"/>
+      <w:color w:val="232C35"/>
       <w:sz w:val="16"/>
     </w:rPr>
   </w:style>

</xml_diff>